<commit_message>
Upload of autoevaluacion of Benjamín
</commit_message>
<xml_diff>
--- a/Fase 1/Evidencias Individuales/SOTO_BENJAMIN_1.1_APT122_AutoevaluacionCompetenciasFase1.docx
+++ b/Fase 1/Evidencias Individuales/SOTO_BENJAMIN_1.1_APT122_AutoevaluacionCompetenciasFase1.docx
@@ -1,6 +1,6 @@
 
 <file path=word/document.xml><?xml version="1.0" encoding="utf-8"?>
-<w:document xmlns:wpc="http://schemas.microsoft.com/office/word/2010/wordprocessingCanvas" xmlns:cx="http://schemas.microsoft.com/office/drawing/2014/chartex" xmlns:cx1="http://schemas.microsoft.com/office/drawing/2015/9/8/chartex" xmlns:cx2="http://schemas.microsoft.com/office/drawing/2015/10/21/chartex" xmlns:cx3="http://schemas.microsoft.com/office/drawing/2016/5/9/chartex" xmlns:cx4="http://schemas.microsoft.com/office/drawing/2016/5/10/chartex" xmlns:cx5="http://schemas.microsoft.com/office/drawing/2016/5/11/chartex" xmlns:cx6="http://schemas.microsoft.com/office/drawing/2016/5/12/chartex" xmlns:cx7="http://schemas.microsoft.com/office/drawing/2016/5/13/chartex" xmlns:cx8="http://schemas.microsoft.com/office/drawing/2016/5/14/chartex" xmlns:mc="http://schemas.openxmlformats.org/markup-compatibility/2006" xmlns:aink="http://schemas.microsoft.com/office/drawing/2016/ink" xmlns:am3d="http://schemas.microsoft.com/office/drawing/2017/model3d" xmlns:o="urn:schemas-microsoft-com:office:office" xmlns:r="http://schemas.openxmlformats.org/officeDocument/2006/relationships" xmlns:m="http://schemas.openxmlformats.org/officeDocument/2006/math" xmlns:v="urn:schemas-microsoft-com:vml" xmlns:wp14="http://schemas.microsoft.com/office/word/2010/wordprocessingDrawing" xmlns:wp="http://schemas.openxmlformats.org/drawingml/2006/wordprocessingDrawing" xmlns:w10="urn:schemas-microsoft-com:office:word" xmlns:w="http://schemas.openxmlformats.org/wordprocessingml/2006/main" xmlns:w14="http://schemas.microsoft.com/office/word/2010/wordml" xmlns:w15="http://schemas.microsoft.com/office/word/2012/wordml" xmlns:w16cex="http://schemas.microsoft.com/office/word/2018/wordml/cex" xmlns:w16cid="http://schemas.microsoft.com/office/word/2016/wordml/cid" xmlns:w16="http://schemas.microsoft.com/office/word/2018/wordml" xmlns:w16sdtdh="http://schemas.microsoft.com/office/word/2020/wordml/sdtdatahash" xmlns:w16se="http://schemas.microsoft.com/office/word/2015/wordml/symex" xmlns:wpg="http://schemas.microsoft.com/office/word/2010/wordprocessingGroup" xmlns:wpi="http://schemas.microsoft.com/office/word/2010/wordprocessingInk" xmlns:wne="http://schemas.microsoft.com/office/word/2006/wordml" xmlns:wps="http://schemas.microsoft.com/office/word/2010/wordprocessingShape" mc:Ignorable="w14 w15 w16se w16cid w16 w16cex w16sdtdh wp14">
+<w:document xmlns:wpc="http://schemas.microsoft.com/office/word/2010/wordprocessingCanvas" xmlns:cx="http://schemas.microsoft.com/office/drawing/2014/chartex" xmlns:cx1="http://schemas.microsoft.com/office/drawing/2015/9/8/chartex" xmlns:cx2="http://schemas.microsoft.com/office/drawing/2015/10/21/chartex" xmlns:cx3="http://schemas.microsoft.com/office/drawing/2016/5/9/chartex" xmlns:cx4="http://schemas.microsoft.com/office/drawing/2016/5/10/chartex" xmlns:cx5="http://schemas.microsoft.com/office/drawing/2016/5/11/chartex" xmlns:cx6="http://schemas.microsoft.com/office/drawing/2016/5/12/chartex" xmlns:cx7="http://schemas.microsoft.com/office/drawing/2016/5/13/chartex" xmlns:cx8="http://schemas.microsoft.com/office/drawing/2016/5/14/chartex" xmlns:mc="http://schemas.openxmlformats.org/markup-compatibility/2006" xmlns:aink="http://schemas.microsoft.com/office/drawing/2016/ink" xmlns:am3d="http://schemas.microsoft.com/office/drawing/2017/model3d" xmlns:o="urn:schemas-microsoft-com:office:office" xmlns:oel="http://schemas.microsoft.com/office/2019/extlst" xmlns:r="http://schemas.openxmlformats.org/officeDocument/2006/relationships" xmlns:m="http://schemas.openxmlformats.org/officeDocument/2006/math" xmlns:v="urn:schemas-microsoft-com:vml" xmlns:wp14="http://schemas.microsoft.com/office/word/2010/wordprocessingDrawing" xmlns:wp="http://schemas.openxmlformats.org/drawingml/2006/wordprocessingDrawing" xmlns:w10="urn:schemas-microsoft-com:office:word" xmlns:w="http://schemas.openxmlformats.org/wordprocessingml/2006/main" xmlns:w14="http://schemas.microsoft.com/office/word/2010/wordml" xmlns:w15="http://schemas.microsoft.com/office/word/2012/wordml" xmlns:w16cex="http://schemas.microsoft.com/office/word/2018/wordml/cex" xmlns:w16cid="http://schemas.microsoft.com/office/word/2016/wordml/cid" xmlns:w16="http://schemas.microsoft.com/office/word/2018/wordml" xmlns:w16du="http://schemas.microsoft.com/office/word/2023/wordml/word16du" xmlns:w16sdtdh="http://schemas.microsoft.com/office/word/2020/wordml/sdtdatahash" xmlns:w16sdtfl="http://schemas.microsoft.com/office/word/2024/wordml/sdtformatlock" xmlns:w16se="http://schemas.microsoft.com/office/word/2015/wordml/symex" xmlns:wpg="http://schemas.microsoft.com/office/word/2010/wordprocessingGroup" xmlns:wpi="http://schemas.microsoft.com/office/word/2010/wordprocessingInk" xmlns:wne="http://schemas.microsoft.com/office/word/2006/wordml" xmlns:wps="http://schemas.microsoft.com/office/word/2010/wordprocessingShape" mc:Ignorable="w14 w15 w16se w16cid w16 w16cex w16sdtdh w16sdtfl w16du wp14">
   <w:body>
     <w:p>
       <w:pPr>
@@ -191,7 +191,25 @@
           <w:sz w:val="24"/>
           <w:szCs w:val="24"/>
         </w:rPr>
-        <w:t xml:space="preserve">Piensa en tu proceso de aprendizaje durante el tiempo que has estudiando en Duoc UC y evalúa el nivel de logro que alcanzaste en cada competencia de tu plan de estudio. </w:t>
+        <w:t xml:space="preserve">Piensa en tu proceso de aprendizaje durante el tiempo que has </w:t>
+      </w:r>
+      <w:proofErr w:type="gramStart"/>
+      <w:r>
+        <w:rPr>
+          <w:rFonts w:eastAsiaTheme="majorEastAsia"/>
+          <w:sz w:val="24"/>
+          <w:szCs w:val="24"/>
+        </w:rPr>
+        <w:t>estudiando</w:t>
+      </w:r>
+      <w:proofErr w:type="gramEnd"/>
+      <w:r>
+        <w:rPr>
+          <w:rFonts w:eastAsiaTheme="majorEastAsia"/>
+          <w:sz w:val="24"/>
+          <w:szCs w:val="24"/>
+        </w:rPr>
+        <w:t xml:space="preserve"> en Duoc UC y evalúa el nivel de logro que alcanzaste en cada competencia de tu plan de estudio. </w:t>
       </w:r>
     </w:p>
     <w:p>
@@ -842,7 +860,7 @@
                 <w:sz w:val="24"/>
                 <w:szCs w:val="24"/>
               </w:rPr>
-              <w:t>Benjamín Alejandro de Jesus Soto Aguilar</w:t>
+              <w:t>Benjamín Alejandro De Jesús Soto Aguilar</w:t>
             </w:r>
           </w:p>
         </w:tc>
@@ -903,7 +921,7 @@
                 <w:sz w:val="24"/>
                 <w:szCs w:val="24"/>
               </w:rPr>
-              <w:t>1446114</w:t>
+              <w:t>Ingeniería en Informática</w:t>
             </w:r>
           </w:p>
         </w:tc>
@@ -1298,46 +1316,22 @@
             <w:pPr>
               <w:jc w:val="center"/>
               <w:rPr>
-                <w:rFonts w:cstheme="minorHAnsi"/>
-                <w:sz w:val="20"/>
-                <w:szCs w:val="20"/>
+                <w:b/>
+                <w:bCs/>
+                <w:color w:val="FF0000"/>
+                <w:sz w:val="18"/>
+                <w:szCs w:val="18"/>
               </w:rPr>
             </w:pPr>
             <w:r>
               <w:rPr>
-                <w:rFonts w:cstheme="minorHAnsi"/>
-                <w:sz w:val="20"/>
-                <w:szCs w:val="20"/>
-              </w:rPr>
-              <w:t>Ofrecer propuestas de solución informática analizando de forma integral los procesos de acuerdo a los</w:t>
-            </w:r>
-          </w:p>
-          <w:p>
-            <w:pPr>
-              <w:jc w:val="center"/>
-              <w:rPr>
-                <w:rFonts w:cstheme="minorHAnsi"/>
-                <w:sz w:val="20"/>
-                <w:szCs w:val="20"/>
-              </w:rPr>
-            </w:pPr>
-          </w:p>
-          <w:p>
-            <w:pPr>
-              <w:jc w:val="center"/>
-              <w:rPr>
-                <w:rFonts w:asciiTheme="majorHAnsi" w:hAnsiTheme="majorHAnsi" w:cstheme="majorHAnsi"/>
-                <w:sz w:val="20"/>
-                <w:szCs w:val="20"/>
-              </w:rPr>
-            </w:pPr>
-            <w:r>
-              <w:rPr>
-                <w:rFonts w:cstheme="minorHAnsi"/>
-                <w:sz w:val="20"/>
-                <w:szCs w:val="20"/>
-              </w:rPr>
-              <w:t>requerimientos de la organización.</w:t>
+                <w:b/>
+                <w:bCs/>
+                <w:color w:val="FF0000"/>
+                <w:sz w:val="18"/>
+                <w:szCs w:val="18"/>
+              </w:rPr>
+              <w:t>Diseñar y generar soluciones de software innovadoras y de calidad, aplicando el ciclo de vida de éste, según las características del proyecto, las mejores prácticas de la industria y sus estándares de calidad.</w:t>
             </w:r>
           </w:p>
         </w:tc>
@@ -1371,15 +1365,119 @@
                 <w:szCs w:val="18"/>
               </w:rPr>
             </w:pPr>
-            <w:r>
+          </w:p>
+          <w:p>
+            <w:pPr>
+              <w:rPr>
+                <w:sz w:val="18"/>
+                <w:szCs w:val="18"/>
+              </w:rPr>
+            </w:pPr>
+          </w:p>
+          <w:p>
+            <w:pPr>
+              <w:rPr>
+                <w:sz w:val="18"/>
+                <w:szCs w:val="18"/>
+              </w:rPr>
+            </w:pPr>
+          </w:p>
+          <w:p>
+            <w:pPr>
+              <w:rPr>
+                <w:sz w:val="18"/>
+                <w:szCs w:val="18"/>
+              </w:rPr>
+            </w:pPr>
+          </w:p>
+          <w:p>
+            <w:pPr>
+              <w:rPr>
+                <w:sz w:val="18"/>
+                <w:szCs w:val="18"/>
+              </w:rPr>
+            </w:pPr>
+          </w:p>
+          <w:p>
+            <w:pPr>
+              <w:rPr>
+                <w:sz w:val="18"/>
+                <w:szCs w:val="18"/>
+              </w:rPr>
+            </w:pPr>
+          </w:p>
+          <w:p>
+            <w:pPr>
               <w:rPr>
                 <w:b/>
                 <w:bCs/>
                 <w:sz w:val="18"/>
                 <w:szCs w:val="18"/>
               </w:rPr>
+            </w:pPr>
+          </w:p>
+          <w:p>
+            <w:pPr>
+              <w:rPr>
+                <w:sz w:val="18"/>
+                <w:szCs w:val="18"/>
+              </w:rPr>
+            </w:pPr>
+          </w:p>
+          <w:p>
+            <w:pPr>
+              <w:rPr>
+                <w:sz w:val="18"/>
+                <w:szCs w:val="18"/>
+              </w:rPr>
+            </w:pPr>
+          </w:p>
+          <w:p>
+            <w:pPr>
+              <w:rPr>
+                <w:b/>
+                <w:bCs/>
+                <w:sz w:val="18"/>
+                <w:szCs w:val="18"/>
+              </w:rPr>
+            </w:pPr>
+          </w:p>
+          <w:p>
+            <w:pPr>
+              <w:rPr>
+                <w:b/>
+                <w:bCs/>
+                <w:sz w:val="18"/>
+                <w:szCs w:val="18"/>
+              </w:rPr>
+            </w:pPr>
+          </w:p>
+          <w:p>
+            <w:pPr>
+              <w:rPr>
+                <w:b/>
+                <w:bCs/>
+                <w:sz w:val="18"/>
+                <w:szCs w:val="18"/>
+              </w:rPr>
+            </w:pPr>
+          </w:p>
+          <w:p>
+            <w:r>
+              <w:rPr>
+                <w:b/>
+                <w:bCs/>
+              </w:rPr>
               <w:t>X</w:t>
             </w:r>
+          </w:p>
+          <w:p>
+            <w:pPr>
+              <w:rPr>
+                <w:sz w:val="18"/>
+                <w:szCs w:val="18"/>
+              </w:rPr>
+            </w:pPr>
           </w:p>
         </w:tc>
         <w:tc>
@@ -1436,7 +1534,9 @@
           </w:tcPr>
           <w:p>
             <w:pPr>
-              <w:jc w:val="center"/>
+              <w:tabs>
+                <w:tab w:val="left" w:pos="288"/>
+              </w:tabs>
               <w:rPr>
                 <w:b/>
                 <w:bCs/>
@@ -1445,14 +1545,58 @@
               </w:rPr>
             </w:pPr>
             <w:r>
+              <w:t xml:space="preserve">Durante mi formación he trabajado el ciclo de vida completo del software en distintos proyectos, aplicando buenas prácticas de la industria. En SITRAC-ANCI estoy a cargo del desarrollo </w:t>
+            </w:r>
+            <w:proofErr w:type="spellStart"/>
+            <w:r>
+              <w:t>backend</w:t>
+            </w:r>
+            <w:proofErr w:type="spellEnd"/>
+            <w:r>
+              <w:t xml:space="preserve"> (integración con la API de INVGATE y los temporizadores de notificación), lo que me exige diseñar la solución siguiendo estándares de calidad y seguridad desde el inicio. Aún me falta reforzar algunos aspectos de documentación técnica formal del ciclo de vida, pero en general tengo un buen dominio del diseño e implementación.</w:t>
+            </w:r>
+          </w:p>
+          <w:p>
+            <w:pPr>
+              <w:tabs>
+                <w:tab w:val="left" w:pos="288"/>
+              </w:tabs>
               <w:rPr>
                 <w:b/>
                 <w:bCs/>
                 <w:sz w:val="18"/>
                 <w:szCs w:val="18"/>
               </w:rPr>
-              <w:t>He sido capaz de realizar un análisis y propuestas correctas y concretas en múltiples instancias, ya sea para trabajos de duoc o para proyectos personales para negocios de personas conocidas</w:t>
-            </w:r>
+            </w:pPr>
+          </w:p>
+          <w:p>
+            <w:pPr>
+              <w:rPr>
+                <w:b/>
+                <w:bCs/>
+                <w:sz w:val="18"/>
+                <w:szCs w:val="18"/>
+              </w:rPr>
+            </w:pPr>
+          </w:p>
+          <w:p>
+            <w:pPr>
+              <w:rPr>
+                <w:b/>
+                <w:bCs/>
+                <w:sz w:val="18"/>
+                <w:szCs w:val="18"/>
+              </w:rPr>
+            </w:pPr>
+          </w:p>
+          <w:p>
+            <w:pPr>
+              <w:ind w:firstLine="708"/>
+              <w:rPr>
+                <w:sz w:val="18"/>
+                <w:szCs w:val="18"/>
+              </w:rPr>
+            </w:pPr>
           </w:p>
         </w:tc>
       </w:tr>
@@ -1472,16 +1616,30 @@
                 <w:b/>
                 <w:bCs/>
                 <w:color w:val="FF0000"/>
-                <w:sz w:val="20"/>
-                <w:szCs w:val="20"/>
+                <w:sz w:val="18"/>
+                <w:szCs w:val="18"/>
               </w:rPr>
             </w:pPr>
             <w:r>
               <w:rPr>
-                <w:sz w:val="20"/>
-                <w:szCs w:val="20"/>
-              </w:rPr>
-              <w:t>Desarrollar una solución de software utilizando técnicas que permitan sistematizar el proceso de desarrollo y mantenimiento, asegurando el logro de los objetivos.</w:t>
+                <w:b/>
+                <w:bCs/>
+                <w:color w:val="FF0000"/>
+                <w:sz w:val="18"/>
+                <w:szCs w:val="18"/>
+              </w:rPr>
+              <w:t xml:space="preserve">Diseñar y adaptar los procesos de ingeniería de requisitos, a través del uso de metodologías de vanguardia y estándares de la </w:t>
+            </w:r>
+            <w:r>
+              <w:rPr>
+                <w:b/>
+                <w:bCs/>
+                <w:color w:val="FF0000"/>
+                <w:sz w:val="18"/>
+                <w:szCs w:val="18"/>
+              </w:rPr>
+              <w:lastRenderedPageBreak/>
+              <w:t>industria, para el desarrollo de soluciones TI complejas, innovadoras y de calidad.</w:t>
             </w:r>
           </w:p>
         </w:tc>
@@ -1515,15 +1673,6 @@
                 <w:szCs w:val="18"/>
               </w:rPr>
             </w:pPr>
-            <w:r>
-              <w:rPr>
-                <w:b/>
-                <w:bCs/>
-                <w:sz w:val="18"/>
-                <w:szCs w:val="18"/>
-              </w:rPr>
-              <w:t>X</w:t>
-            </w:r>
           </w:p>
         </w:tc>
         <w:tc>
@@ -1540,6 +1689,23 @@
                 <w:szCs w:val="18"/>
               </w:rPr>
             </w:pPr>
+          </w:p>
+          <w:p>
+            <w:pPr>
+              <w:rPr>
+                <w:sz w:val="18"/>
+                <w:szCs w:val="18"/>
+              </w:rPr>
+            </w:pPr>
+            <w:r>
+              <w:rPr>
+                <w:b/>
+                <w:bCs/>
+                <w:sz w:val="18"/>
+                <w:szCs w:val="18"/>
+              </w:rPr>
+              <w:t>X</w:t>
+            </w:r>
           </w:p>
         </w:tc>
         <w:tc>
@@ -1581,6 +1747,26 @@
           <w:p>
             <w:pPr>
               <w:jc w:val="center"/>
+            </w:pPr>
+            <w:r>
+              <w:t xml:space="preserve">Manejo los conceptos básicos de ingeniería de requisitos, como historias de usuario y el estándar IEEE 830 que usamos para </w:t>
+            </w:r>
+            <w:r>
+              <w:lastRenderedPageBreak/>
+              <w:t xml:space="preserve">el ERS de apoyo, y participo activamente en las reuniones de levantamiento con </w:t>
+            </w:r>
+            <w:proofErr w:type="spellStart"/>
+            <w:r>
+              <w:t>UltraPort</w:t>
+            </w:r>
+            <w:proofErr w:type="spellEnd"/>
+            <w:r>
+              <w:t>. Sin embargo, en el equipo esta labor la lidera principalmente mi compañero Rodrigo, quien se encarga de formalizar la documentación normativa. Necesito reforzar la elaboración autónoma de documentos de requisitos más complejos.</w:t>
+            </w:r>
+          </w:p>
+          <w:p>
+            <w:pPr>
+              <w:jc w:val="center"/>
               <w:rPr>
                 <w:b/>
                 <w:bCs/>
@@ -1588,15 +1774,6 @@
                 <w:szCs w:val="18"/>
               </w:rPr>
             </w:pPr>
-            <w:r>
-              <w:rPr>
-                <w:b/>
-                <w:bCs/>
-                <w:sz w:val="18"/>
-                <w:szCs w:val="18"/>
-              </w:rPr>
-              <w:t>De la mano del desarrollo de soluciones informáticas y software he mantenido el uso de las practicas necesarias para desarrollo y mantenimiento</w:t>
-            </w:r>
           </w:p>
         </w:tc>
       </w:tr>
@@ -1615,16 +1792,18 @@
               <w:rPr>
                 <w:b/>
                 <w:bCs/>
-                <w:sz w:val="20"/>
-                <w:szCs w:val="20"/>
+                <w:sz w:val="18"/>
+                <w:szCs w:val="18"/>
               </w:rPr>
             </w:pPr>
             <w:r>
               <w:rPr>
-                <w:sz w:val="20"/>
-                <w:szCs w:val="20"/>
-              </w:rPr>
-              <w:t>Construir Modelos de datos para soportar los requerimientos de la organización acuerdo a un diseño definido y escalable en el tiempo.</w:t>
+                <w:b/>
+                <w:bCs/>
+                <w:sz w:val="18"/>
+                <w:szCs w:val="18"/>
+              </w:rPr>
+              <w:t>Diseñar y generar soluciones que permitan resolver los requerimientos de información en el contexto de las organizaciones, considerando bases de datos relacionales y no relacionales.</w:t>
             </w:r>
           </w:p>
         </w:tc>
@@ -1659,6 +1838,85 @@
               </w:rPr>
             </w:pPr>
           </w:p>
+          <w:p>
+            <w:pPr>
+              <w:rPr>
+                <w:sz w:val="18"/>
+                <w:szCs w:val="18"/>
+              </w:rPr>
+            </w:pPr>
+          </w:p>
+          <w:p>
+            <w:pPr>
+              <w:rPr>
+                <w:sz w:val="18"/>
+                <w:szCs w:val="18"/>
+              </w:rPr>
+            </w:pPr>
+          </w:p>
+          <w:p>
+            <w:pPr>
+              <w:rPr>
+                <w:sz w:val="18"/>
+                <w:szCs w:val="18"/>
+              </w:rPr>
+            </w:pPr>
+          </w:p>
+          <w:p>
+            <w:pPr>
+              <w:rPr>
+                <w:b/>
+                <w:bCs/>
+                <w:sz w:val="18"/>
+                <w:szCs w:val="18"/>
+              </w:rPr>
+            </w:pPr>
+          </w:p>
+          <w:p>
+            <w:pPr>
+              <w:rPr>
+                <w:sz w:val="18"/>
+                <w:szCs w:val="18"/>
+              </w:rPr>
+            </w:pPr>
+          </w:p>
+          <w:p>
+            <w:pPr>
+              <w:rPr>
+                <w:b/>
+                <w:bCs/>
+                <w:sz w:val="18"/>
+                <w:szCs w:val="18"/>
+              </w:rPr>
+            </w:pPr>
+          </w:p>
+          <w:p>
+            <w:pPr>
+              <w:rPr>
+                <w:b/>
+                <w:bCs/>
+                <w:sz w:val="18"/>
+                <w:szCs w:val="18"/>
+              </w:rPr>
+            </w:pPr>
+          </w:p>
+          <w:p>
+            <w:pPr>
+              <w:rPr>
+                <w:sz w:val="18"/>
+                <w:szCs w:val="18"/>
+              </w:rPr>
+            </w:pPr>
+            <w:r>
+              <w:rPr>
+                <w:b/>
+                <w:bCs/>
+                <w:sz w:val="18"/>
+                <w:szCs w:val="18"/>
+              </w:rPr>
+              <w:t>X</w:t>
+            </w:r>
+          </w:p>
         </w:tc>
         <w:tc>
           <w:tcPr>
@@ -1674,15 +1932,6 @@
                 <w:szCs w:val="18"/>
               </w:rPr>
             </w:pPr>
-            <w:r>
-              <w:rPr>
-                <w:b/>
-                <w:bCs/>
-                <w:sz w:val="18"/>
-                <w:szCs w:val="18"/>
-              </w:rPr>
-              <w:t>X</w:t>
-            </w:r>
           </w:p>
         </w:tc>
         <w:tc>
@@ -1722,8 +1971,20 @@
             <w:tcW w:w="2557" w:type="dxa"/>
           </w:tcPr>
           <w:p>
+            <w:r>
+              <w:t xml:space="preserve">Estoy directamente a cargo de implementar la base de datos propia del proyecto en SQL Server, con migraciones versionadas mediante la librería </w:t>
+            </w:r>
+            <w:proofErr w:type="spellStart"/>
+            <w:r>
+              <w:t>Evolve</w:t>
+            </w:r>
+            <w:proofErr w:type="spellEnd"/>
+            <w:r>
+              <w:t>, por lo que tengo un buen manejo del modelado de datos relacionales aplicado a un caso real. Me falta profundizar en bases de datos no relacionales, ya que este proyecto no las requiere y mi experiencia previa con ellas es más acotada.</w:t>
+            </w:r>
+          </w:p>
+          <w:p>
             <w:pPr>
-              <w:jc w:val="center"/>
               <w:rPr>
                 <w:b/>
                 <w:bCs/>
@@ -1731,33 +1992,6 @@
                 <w:szCs w:val="18"/>
               </w:rPr>
             </w:pPr>
-            <w:r>
-              <w:rPr>
-                <w:b/>
-                <w:bCs/>
-                <w:sz w:val="18"/>
-                <w:szCs w:val="18"/>
-              </w:rPr>
-              <w:t>He desarrollado modelos de datos durante mi aprendizaje en duo</w:t>
-            </w:r>
-            <w:r>
-              <w:rPr>
-                <w:b/>
-                <w:bCs/>
-                <w:sz w:val="18"/>
-                <w:szCs w:val="18"/>
-              </w:rPr>
-              <w:t>c</w:t>
-            </w:r>
-            <w:r>
-              <w:rPr>
-                <w:b/>
-                <w:bCs/>
-                <w:sz w:val="18"/>
-                <w:szCs w:val="18"/>
-              </w:rPr>
-              <w:t xml:space="preserve"> pero no he puesto en practica mis conocimientos más allá de en proyectos personales</w:t>
-            </w:r>
           </w:p>
         </w:tc>
       </w:tr>
@@ -1776,16 +2010,18 @@
               <w:rPr>
                 <w:b/>
                 <w:bCs/>
-                <w:sz w:val="20"/>
-                <w:szCs w:val="20"/>
+                <w:sz w:val="18"/>
+                <w:szCs w:val="18"/>
               </w:rPr>
             </w:pPr>
             <w:r>
               <w:rPr>
-                <w:sz w:val="20"/>
-                <w:szCs w:val="20"/>
-              </w:rPr>
-              <w:t>Programar consultas o rutinas para manipular información de una base de datos de acuerdo a los requerimientos de la organización.</w:t>
+                <w:b/>
+                <w:bCs/>
+                <w:sz w:val="18"/>
+                <w:szCs w:val="18"/>
+              </w:rPr>
+              <w:t>Desarrollar proyectos de software innovadores para plataformas y dispositivos móviles, por medio de marcos de trabajo, herramientas de desarrollo, lenguajes de programación y buenas prácticas de la industria del desarrollo de software.</w:t>
             </w:r>
           </w:p>
         </w:tc>
@@ -1803,15 +2039,6 @@
                 <w:szCs w:val="18"/>
               </w:rPr>
             </w:pPr>
-            <w:r>
-              <w:rPr>
-                <w:b/>
-                <w:bCs/>
-                <w:sz w:val="18"/>
-                <w:szCs w:val="18"/>
-              </w:rPr>
-              <w:t>X</w:t>
-            </w:r>
           </w:p>
         </w:tc>
         <w:tc>
@@ -1829,14 +2056,32 @@
               </w:rPr>
             </w:pPr>
           </w:p>
-        </w:tc>
-        <w:tc>
-          <w:tcPr>
-            <w:tcW w:w="1055" w:type="dxa"/>
-          </w:tcPr>
           <w:p>
             <w:pPr>
-              <w:jc w:val="center"/>
+              <w:rPr>
+                <w:sz w:val="18"/>
+                <w:szCs w:val="18"/>
+              </w:rPr>
+            </w:pPr>
+          </w:p>
+          <w:p>
+            <w:pPr>
+              <w:rPr>
+                <w:sz w:val="18"/>
+                <w:szCs w:val="18"/>
+              </w:rPr>
+            </w:pPr>
+          </w:p>
+          <w:p>
+            <w:pPr>
+              <w:rPr>
+                <w:sz w:val="18"/>
+                <w:szCs w:val="18"/>
+              </w:rPr>
+            </w:pPr>
+          </w:p>
+          <w:p>
+            <w:pPr>
               <w:rPr>
                 <w:b/>
                 <w:bCs/>
@@ -1845,14 +2090,8 @@
               </w:rPr>
             </w:pPr>
           </w:p>
-        </w:tc>
-        <w:tc>
-          <w:tcPr>
-            <w:tcW w:w="1187" w:type="dxa"/>
-          </w:tcPr>
           <w:p>
             <w:pPr>
-              <w:jc w:val="center"/>
               <w:rPr>
                 <w:b/>
                 <w:bCs/>
@@ -1861,14 +2100,8 @@
               </w:rPr>
             </w:pPr>
           </w:p>
-        </w:tc>
-        <w:tc>
-          <w:tcPr>
-            <w:tcW w:w="1250" w:type="dxa"/>
-          </w:tcPr>
           <w:p>
             <w:pPr>
-              <w:jc w:val="center"/>
               <w:rPr>
                 <w:b/>
                 <w:bCs/>
@@ -1877,14 +2110,8 @@
               </w:rPr>
             </w:pPr>
           </w:p>
-        </w:tc>
-        <w:tc>
-          <w:tcPr>
-            <w:tcW w:w="2557" w:type="dxa"/>
-          </w:tcPr>
           <w:p>
             <w:pPr>
-              <w:jc w:val="center"/>
               <w:rPr>
                 <w:b/>
                 <w:bCs/>
@@ -1892,225 +2119,10 @@
                 <w:szCs w:val="18"/>
               </w:rPr>
             </w:pPr>
-            <w:r>
-              <w:rPr>
-                <w:b/>
-                <w:bCs/>
-                <w:sz w:val="18"/>
-                <w:szCs w:val="18"/>
-              </w:rPr>
-              <w:t>Entiendo el funcionamiento perfectamente, quizás el flujo de las consultas no es mi fuerte pero el programar peticiones especificas me manejo completamente</w:t>
-            </w:r>
           </w:p>
-        </w:tc>
-      </w:tr>
-      <w:tr>
-        <w:trPr>
-          <w:trHeight w:val="591"/>
-          <w:jc w:val="center"/>
-        </w:trPr>
-        <w:tc>
-          <w:tcPr>
-            <w:tcW w:w="1931" w:type="dxa"/>
-          </w:tcPr>
           <w:p>
             <w:pPr>
-              <w:jc w:val="center"/>
-              <w:rPr>
-                <w:b/>
-                <w:bCs/>
-                <w:sz w:val="20"/>
-                <w:szCs w:val="20"/>
-              </w:rPr>
-            </w:pPr>
-            <w:r>
-              <w:rPr>
-                <w:sz w:val="20"/>
-                <w:szCs w:val="20"/>
-              </w:rPr>
-              <w:lastRenderedPageBreak/>
-              <w:t>Construir programas y rutinas de variada complejidad para dar solución a requerimientos de la organización, acordes a tecnologías de mercado y utilizando buenas prácticas de codificación.</w:t>
-            </w:r>
-          </w:p>
-        </w:tc>
-        <w:tc>
-          <w:tcPr>
-            <w:tcW w:w="1017" w:type="dxa"/>
-          </w:tcPr>
-          <w:p>
-            <w:pPr>
-              <w:jc w:val="center"/>
-              <w:rPr>
-                <w:b/>
-                <w:bCs/>
-                <w:sz w:val="18"/>
-                <w:szCs w:val="18"/>
-              </w:rPr>
-            </w:pPr>
-          </w:p>
-        </w:tc>
-        <w:tc>
-          <w:tcPr>
-            <w:tcW w:w="926" w:type="dxa"/>
-          </w:tcPr>
-          <w:p>
-            <w:pPr>
-              <w:jc w:val="center"/>
-              <w:rPr>
-                <w:b/>
-                <w:bCs/>
-                <w:sz w:val="18"/>
-                <w:szCs w:val="18"/>
-              </w:rPr>
-            </w:pPr>
-          </w:p>
-        </w:tc>
-        <w:tc>
-          <w:tcPr>
-            <w:tcW w:w="1055" w:type="dxa"/>
-          </w:tcPr>
-          <w:p>
-            <w:pPr>
-              <w:jc w:val="center"/>
-              <w:rPr>
-                <w:b/>
-                <w:bCs/>
-                <w:sz w:val="18"/>
-                <w:szCs w:val="18"/>
-              </w:rPr>
-            </w:pPr>
-            <w:r>
-              <w:rPr>
-                <w:b/>
-                <w:bCs/>
-                <w:sz w:val="18"/>
-                <w:szCs w:val="18"/>
-              </w:rPr>
-              <w:t>X</w:t>
-            </w:r>
-          </w:p>
-        </w:tc>
-        <w:tc>
-          <w:tcPr>
-            <w:tcW w:w="1187" w:type="dxa"/>
-          </w:tcPr>
-          <w:p>
-            <w:pPr>
-              <w:jc w:val="center"/>
-              <w:rPr>
-                <w:b/>
-                <w:bCs/>
-                <w:sz w:val="18"/>
-                <w:szCs w:val="18"/>
-              </w:rPr>
-            </w:pPr>
-          </w:p>
-        </w:tc>
-        <w:tc>
-          <w:tcPr>
-            <w:tcW w:w="1250" w:type="dxa"/>
-          </w:tcPr>
-          <w:p>
-            <w:pPr>
-              <w:jc w:val="center"/>
-              <w:rPr>
-                <w:b/>
-                <w:bCs/>
-                <w:sz w:val="18"/>
-                <w:szCs w:val="18"/>
-              </w:rPr>
-            </w:pPr>
-          </w:p>
-        </w:tc>
-        <w:tc>
-          <w:tcPr>
-            <w:tcW w:w="2557" w:type="dxa"/>
-          </w:tcPr>
-          <w:p>
-            <w:pPr>
-              <w:jc w:val="center"/>
-              <w:rPr>
-                <w:b/>
-                <w:bCs/>
-                <w:sz w:val="18"/>
-                <w:szCs w:val="18"/>
-              </w:rPr>
-            </w:pPr>
-            <w:r>
-              <w:rPr>
-                <w:b/>
-                <w:bCs/>
-                <w:sz w:val="18"/>
-                <w:szCs w:val="18"/>
-              </w:rPr>
-              <w:t xml:space="preserve">Me manejo de manera decente gracias a las clases, pero no he automatizado muchos procesos, he realizado sistemas y programas que automatizan trabajos manuales, pero fuera de </w:t>
-            </w:r>
-            <w:r>
-              <w:rPr>
-                <w:b/>
-                <w:bCs/>
-                <w:sz w:val="18"/>
-                <w:szCs w:val="18"/>
-              </w:rPr>
-              <w:t>Duoc</w:t>
-            </w:r>
-          </w:p>
-        </w:tc>
-      </w:tr>
-      <w:tr>
-        <w:trPr>
-          <w:trHeight w:val="576"/>
-          <w:jc w:val="center"/>
-        </w:trPr>
-        <w:tc>
-          <w:tcPr>
-            <w:tcW w:w="1931" w:type="dxa"/>
-          </w:tcPr>
-          <w:p>
-            <w:pPr>
-              <w:jc w:val="center"/>
-              <w:rPr>
-                <w:b/>
-                <w:bCs/>
-                <w:sz w:val="20"/>
-                <w:szCs w:val="20"/>
-              </w:rPr>
-            </w:pPr>
-            <w:r>
-              <w:rPr>
-                <w:sz w:val="20"/>
-                <w:szCs w:val="20"/>
-              </w:rPr>
-              <w:t>Realizar pruebas de certificación tanto de los productos como de los procesos utilizando buenas prácticas definidas por la industria.</w:t>
-            </w:r>
-          </w:p>
-        </w:tc>
-        <w:tc>
-          <w:tcPr>
-            <w:tcW w:w="1017" w:type="dxa"/>
-          </w:tcPr>
-          <w:p>
-            <w:pPr>
-              <w:jc w:val="center"/>
-              <w:rPr>
-                <w:b/>
-                <w:bCs/>
-                <w:sz w:val="18"/>
-                <w:szCs w:val="18"/>
-              </w:rPr>
-            </w:pPr>
-          </w:p>
-        </w:tc>
-        <w:tc>
-          <w:tcPr>
-            <w:tcW w:w="926" w:type="dxa"/>
-          </w:tcPr>
-          <w:p>
-            <w:pPr>
-              <w:jc w:val="center"/>
-              <w:rPr>
-                <w:b/>
-                <w:bCs/>
+              <w:rPr>
                 <w:sz w:val="18"/>
                 <w:szCs w:val="18"/>
               </w:rPr>
@@ -2179,2040 +2191,28 @@
             <w:tcW w:w="2557" w:type="dxa"/>
           </w:tcPr>
           <w:p>
-            <w:pPr>
-              <w:jc w:val="center"/>
-              <w:rPr>
-                <w:b/>
-                <w:bCs/>
-                <w:sz w:val="18"/>
-                <w:szCs w:val="18"/>
-              </w:rPr>
-            </w:pPr>
             <w:r>
-              <w:rPr>
-                <w:b/>
-                <w:bCs/>
-                <w:sz w:val="18"/>
-                <w:szCs w:val="18"/>
-              </w:rPr>
-              <w:t xml:space="preserve">He realizado múltiples pruebas durante mi trabajo y mi estudio durante </w:t>
+              <w:t xml:space="preserve">Tengo un buen conocimiento de desarrollo de aplicaciones móviles y manejo de </w:t>
+            </w:r>
+            <w:proofErr w:type="spellStart"/>
+            <w:r>
+              <w:t>backend</w:t>
+            </w:r>
+            <w:proofErr w:type="spellEnd"/>
+            <w:r>
+              <w:t xml:space="preserve"> web, con dominio de marcos de trabajo, lenguajes de programación (.NET Core, Node.js) y buenas prácticas de desarrollo. Esto lo aplico directamente en la </w:t>
             </w:r>
             <w:r>
-              <w:rPr>
-                <w:b/>
-                <w:bCs/>
-                <w:sz w:val="18"/>
-                <w:szCs w:val="18"/>
-              </w:rPr>
-              <w:t>Duoc</w:t>
+              <w:lastRenderedPageBreak/>
+              <w:t xml:space="preserve">integración </w:t>
             </w:r>
-          </w:p>
-        </w:tc>
-      </w:tr>
-      <w:tr>
-        <w:trPr>
-          <w:trHeight w:val="591"/>
-          <w:jc w:val="center"/>
-        </w:trPr>
-        <w:tc>
-          <w:tcPr>
-            <w:tcW w:w="1931" w:type="dxa"/>
-          </w:tcPr>
-          <w:p>
-            <w:pPr>
-              <w:jc w:val="center"/>
-              <w:rPr>
-                <w:b/>
-                <w:bCs/>
-                <w:sz w:val="20"/>
-                <w:szCs w:val="20"/>
-              </w:rPr>
-            </w:pPr>
+            <w:proofErr w:type="spellStart"/>
             <w:r>
-              <w:rPr>
-                <w:sz w:val="20"/>
-                <w:szCs w:val="20"/>
-              </w:rPr>
-              <w:t>Construir el modelo arquitectónico de una solución sistémica que soporte los procesos de negocio de acuerdo los requerimientos de la organización y estándares industria.</w:t>
+              <w:t>backend</w:t>
             </w:r>
-          </w:p>
-        </w:tc>
-        <w:tc>
-          <w:tcPr>
-            <w:tcW w:w="1017" w:type="dxa"/>
-          </w:tcPr>
-          <w:p>
-            <w:pPr>
-              <w:jc w:val="center"/>
-              <w:rPr>
-                <w:b/>
-                <w:bCs/>
-                <w:sz w:val="18"/>
-                <w:szCs w:val="18"/>
-              </w:rPr>
-            </w:pPr>
+            <w:proofErr w:type="spellEnd"/>
             <w:r>
-              <w:rPr>
-                <w:b/>
-                <w:bCs/>
-                <w:sz w:val="18"/>
-                <w:szCs w:val="18"/>
-              </w:rPr>
-              <w:t>X</w:t>
-            </w:r>
-          </w:p>
-        </w:tc>
-        <w:tc>
-          <w:tcPr>
-            <w:tcW w:w="926" w:type="dxa"/>
-          </w:tcPr>
-          <w:p>
-            <w:pPr>
-              <w:jc w:val="center"/>
-              <w:rPr>
-                <w:b/>
-                <w:bCs/>
-                <w:sz w:val="18"/>
-                <w:szCs w:val="18"/>
-              </w:rPr>
-            </w:pPr>
-          </w:p>
-        </w:tc>
-        <w:tc>
-          <w:tcPr>
-            <w:tcW w:w="1055" w:type="dxa"/>
-          </w:tcPr>
-          <w:p>
-            <w:pPr>
-              <w:jc w:val="center"/>
-              <w:rPr>
-                <w:b/>
-                <w:bCs/>
-                <w:sz w:val="18"/>
-                <w:szCs w:val="18"/>
-              </w:rPr>
-            </w:pPr>
-          </w:p>
-        </w:tc>
-        <w:tc>
-          <w:tcPr>
-            <w:tcW w:w="1187" w:type="dxa"/>
-          </w:tcPr>
-          <w:p>
-            <w:pPr>
-              <w:ind w:left="708" w:hanging="708"/>
-              <w:jc w:val="center"/>
-              <w:rPr>
-                <w:b/>
-                <w:bCs/>
-                <w:sz w:val="18"/>
-                <w:szCs w:val="18"/>
-              </w:rPr>
-            </w:pPr>
-          </w:p>
-        </w:tc>
-        <w:tc>
-          <w:tcPr>
-            <w:tcW w:w="1250" w:type="dxa"/>
-          </w:tcPr>
-          <w:p>
-            <w:pPr>
-              <w:jc w:val="center"/>
-              <w:rPr>
-                <w:b/>
-                <w:bCs/>
-                <w:sz w:val="18"/>
-                <w:szCs w:val="18"/>
-              </w:rPr>
-            </w:pPr>
-          </w:p>
-        </w:tc>
-        <w:tc>
-          <w:tcPr>
-            <w:tcW w:w="2557" w:type="dxa"/>
-          </w:tcPr>
-          <w:p>
-            <w:pPr>
-              <w:jc w:val="center"/>
-              <w:rPr>
-                <w:b/>
-                <w:bCs/>
-                <w:sz w:val="18"/>
-                <w:szCs w:val="18"/>
-              </w:rPr>
-            </w:pPr>
-            <w:r>
-              <w:rPr>
-                <w:b/>
-                <w:bCs/>
-                <w:sz w:val="18"/>
-                <w:szCs w:val="18"/>
-              </w:rPr>
-              <w:t>La arquitectura es uno de mis fuertes, entender el flujo de los procesos en busca de soporte sistemático se me dio espectacular durante mi aprendizaje</w:t>
-            </w:r>
-          </w:p>
-        </w:tc>
-      </w:tr>
-      <w:tr>
-        <w:trPr>
-          <w:trHeight w:val="576"/>
-          <w:jc w:val="center"/>
-        </w:trPr>
-        <w:tc>
-          <w:tcPr>
-            <w:tcW w:w="1931" w:type="dxa"/>
-          </w:tcPr>
-          <w:p>
-            <w:pPr>
-              <w:jc w:val="center"/>
-              <w:rPr>
-                <w:b/>
-                <w:bCs/>
-                <w:sz w:val="20"/>
-                <w:szCs w:val="20"/>
-              </w:rPr>
-            </w:pPr>
-            <w:r>
-              <w:rPr>
-                <w:sz w:val="20"/>
-                <w:szCs w:val="20"/>
-              </w:rPr>
-              <w:t>Implementar soluciones sistémicas integrales para automatizar u optimizar procesos de negocio de acuerdo a las necesidades de la organización.</w:t>
-            </w:r>
-          </w:p>
-        </w:tc>
-        <w:tc>
-          <w:tcPr>
-            <w:tcW w:w="1017" w:type="dxa"/>
-          </w:tcPr>
-          <w:p>
-            <w:pPr>
-              <w:jc w:val="center"/>
-              <w:rPr>
-                <w:b/>
-                <w:bCs/>
-                <w:sz w:val="18"/>
-                <w:szCs w:val="18"/>
-              </w:rPr>
-            </w:pPr>
-          </w:p>
-        </w:tc>
-        <w:tc>
-          <w:tcPr>
-            <w:tcW w:w="926" w:type="dxa"/>
-          </w:tcPr>
-          <w:p>
-            <w:pPr>
-              <w:jc w:val="center"/>
-              <w:rPr>
-                <w:b/>
-                <w:bCs/>
-                <w:sz w:val="18"/>
-                <w:szCs w:val="18"/>
-              </w:rPr>
-            </w:pPr>
-            <w:r>
-              <w:rPr>
-                <w:b/>
-                <w:bCs/>
-                <w:sz w:val="18"/>
-                <w:szCs w:val="18"/>
-              </w:rPr>
-              <w:t>X</w:t>
-            </w:r>
-          </w:p>
-        </w:tc>
-        <w:tc>
-          <w:tcPr>
-            <w:tcW w:w="1055" w:type="dxa"/>
-          </w:tcPr>
-          <w:p>
-            <w:pPr>
-              <w:jc w:val="center"/>
-              <w:rPr>
-                <w:b/>
-                <w:bCs/>
-                <w:sz w:val="18"/>
-                <w:szCs w:val="18"/>
-              </w:rPr>
-            </w:pPr>
-          </w:p>
-        </w:tc>
-        <w:tc>
-          <w:tcPr>
-            <w:tcW w:w="1187" w:type="dxa"/>
-          </w:tcPr>
-          <w:p>
-            <w:pPr>
-              <w:jc w:val="center"/>
-              <w:rPr>
-                <w:b/>
-                <w:bCs/>
-                <w:sz w:val="18"/>
-                <w:szCs w:val="18"/>
-              </w:rPr>
-            </w:pPr>
-          </w:p>
-        </w:tc>
-        <w:tc>
-          <w:tcPr>
-            <w:tcW w:w="1250" w:type="dxa"/>
-          </w:tcPr>
-          <w:p>
-            <w:pPr>
-              <w:jc w:val="center"/>
-              <w:rPr>
-                <w:b/>
-                <w:bCs/>
-                <w:sz w:val="18"/>
-                <w:szCs w:val="18"/>
-              </w:rPr>
-            </w:pPr>
-          </w:p>
-        </w:tc>
-        <w:tc>
-          <w:tcPr>
-            <w:tcW w:w="2557" w:type="dxa"/>
-          </w:tcPr>
-          <w:p>
-            <w:pPr>
-              <w:jc w:val="center"/>
-              <w:rPr>
-                <w:b/>
-                <w:bCs/>
-                <w:sz w:val="18"/>
-                <w:szCs w:val="18"/>
-              </w:rPr>
-            </w:pPr>
-            <w:r>
-              <w:rPr>
-                <w:b/>
-                <w:bCs/>
-                <w:sz w:val="18"/>
-                <w:szCs w:val="18"/>
-              </w:rPr>
-              <w:t>Me siento bastante capaz de poder implementar dichas soluciones, debido a mis proyectos personales y estudios</w:t>
-            </w:r>
-          </w:p>
-        </w:tc>
-      </w:tr>
-      <w:tr>
-        <w:trPr>
-          <w:trHeight w:val="576"/>
-          <w:jc w:val="center"/>
-        </w:trPr>
-        <w:tc>
-          <w:tcPr>
-            <w:tcW w:w="1931" w:type="dxa"/>
-          </w:tcPr>
-          <w:p>
-            <w:pPr>
-              <w:jc w:val="center"/>
-              <w:rPr>
-                <w:sz w:val="20"/>
-                <w:szCs w:val="20"/>
-              </w:rPr>
-            </w:pPr>
-            <w:r>
-              <w:rPr>
-                <w:sz w:val="20"/>
-                <w:szCs w:val="20"/>
-              </w:rPr>
-              <w:t>Resolver las vulnerabilidades sistémicas para asegurar que el software construido cumple las normas de seguridad exigidas por la industria.</w:t>
-            </w:r>
-          </w:p>
-        </w:tc>
-        <w:tc>
-          <w:tcPr>
-            <w:tcW w:w="1017" w:type="dxa"/>
-          </w:tcPr>
-          <w:p>
-            <w:pPr>
-              <w:jc w:val="center"/>
-              <w:rPr>
-                <w:b/>
-                <w:bCs/>
-                <w:sz w:val="18"/>
-                <w:szCs w:val="18"/>
-              </w:rPr>
-            </w:pPr>
-            <w:r>
-              <w:rPr>
-                <w:b/>
-                <w:bCs/>
-                <w:sz w:val="18"/>
-                <w:szCs w:val="18"/>
-              </w:rPr>
-              <w:t>X</w:t>
-            </w:r>
-          </w:p>
-        </w:tc>
-        <w:tc>
-          <w:tcPr>
-            <w:tcW w:w="926" w:type="dxa"/>
-          </w:tcPr>
-          <w:p>
-            <w:pPr>
-              <w:jc w:val="center"/>
-              <w:rPr>
-                <w:b/>
-                <w:bCs/>
-                <w:sz w:val="18"/>
-                <w:szCs w:val="18"/>
-              </w:rPr>
-            </w:pPr>
-          </w:p>
-        </w:tc>
-        <w:tc>
-          <w:tcPr>
-            <w:tcW w:w="1055" w:type="dxa"/>
-          </w:tcPr>
-          <w:p>
-            <w:pPr>
-              <w:jc w:val="center"/>
-              <w:rPr>
-                <w:b/>
-                <w:bCs/>
-                <w:sz w:val="18"/>
-                <w:szCs w:val="18"/>
-              </w:rPr>
-            </w:pPr>
-          </w:p>
-        </w:tc>
-        <w:tc>
-          <w:tcPr>
-            <w:tcW w:w="1187" w:type="dxa"/>
-          </w:tcPr>
-          <w:p>
-            <w:pPr>
-              <w:jc w:val="center"/>
-              <w:rPr>
-                <w:b/>
-                <w:bCs/>
-                <w:sz w:val="18"/>
-                <w:szCs w:val="18"/>
-              </w:rPr>
-            </w:pPr>
-          </w:p>
-        </w:tc>
-        <w:tc>
-          <w:tcPr>
-            <w:tcW w:w="1250" w:type="dxa"/>
-          </w:tcPr>
-          <w:p>
-            <w:pPr>
-              <w:jc w:val="center"/>
-              <w:rPr>
-                <w:b/>
-                <w:bCs/>
-                <w:sz w:val="18"/>
-                <w:szCs w:val="18"/>
-              </w:rPr>
-            </w:pPr>
-          </w:p>
-        </w:tc>
-        <w:tc>
-          <w:tcPr>
-            <w:tcW w:w="2557" w:type="dxa"/>
-          </w:tcPr>
-          <w:p>
-            <w:pPr>
-              <w:jc w:val="center"/>
-              <w:rPr>
-                <w:b/>
-                <w:bCs/>
-                <w:sz w:val="18"/>
-                <w:szCs w:val="18"/>
-              </w:rPr>
-            </w:pPr>
-            <w:r>
-              <w:rPr>
-                <w:b/>
-                <w:bCs/>
-                <w:sz w:val="18"/>
-                <w:szCs w:val="18"/>
-              </w:rPr>
-              <w:t xml:space="preserve">He realizado </w:t>
-            </w:r>
-            <w:r>
-              <w:rPr>
-                <w:b/>
-                <w:bCs/>
-                <w:sz w:val="18"/>
-                <w:szCs w:val="18"/>
-              </w:rPr>
-              <w:t>múltiples</w:t>
-            </w:r>
-            <w:r>
-              <w:rPr>
-                <w:b/>
-                <w:bCs/>
-                <w:sz w:val="18"/>
-                <w:szCs w:val="18"/>
-              </w:rPr>
-              <w:t xml:space="preserve"> revisiones de seguridad para que las aplicaciones y sistemas realizados tengan estándares correctos</w:t>
-            </w:r>
-          </w:p>
-        </w:tc>
-      </w:tr>
-      <w:tr>
-        <w:trPr>
-          <w:trHeight w:val="576"/>
-          <w:jc w:val="center"/>
-        </w:trPr>
-        <w:tc>
-          <w:tcPr>
-            <w:tcW w:w="1931" w:type="dxa"/>
-          </w:tcPr>
-          <w:p>
-            <w:pPr>
-              <w:jc w:val="center"/>
-              <w:rPr>
-                <w:sz w:val="20"/>
-                <w:szCs w:val="20"/>
-              </w:rPr>
-            </w:pPr>
-            <w:r>
-              <w:rPr>
-                <w:sz w:val="20"/>
-                <w:szCs w:val="20"/>
-              </w:rPr>
-              <w:t xml:space="preserve">Gestionar proyectos informáticos, ofreciendo alternativas para la toma de decisiones </w:t>
-            </w:r>
-            <w:r>
-              <w:rPr>
-                <w:sz w:val="20"/>
-                <w:szCs w:val="20"/>
-              </w:rPr>
-              <w:lastRenderedPageBreak/>
-              <w:t>de acuerdo a los requerimientos de la organización.</w:t>
-            </w:r>
-          </w:p>
-        </w:tc>
-        <w:tc>
-          <w:tcPr>
-            <w:tcW w:w="1017" w:type="dxa"/>
-          </w:tcPr>
-          <w:p>
-            <w:pPr>
-              <w:jc w:val="center"/>
-              <w:rPr>
-                <w:b/>
-                <w:bCs/>
-                <w:sz w:val="18"/>
-                <w:szCs w:val="18"/>
-              </w:rPr>
-            </w:pPr>
-            <w:r>
-              <w:rPr>
-                <w:b/>
-                <w:bCs/>
-                <w:sz w:val="18"/>
-                <w:szCs w:val="18"/>
-              </w:rPr>
-              <w:lastRenderedPageBreak/>
-              <w:t>X</w:t>
-            </w:r>
-          </w:p>
-        </w:tc>
-        <w:tc>
-          <w:tcPr>
-            <w:tcW w:w="926" w:type="dxa"/>
-          </w:tcPr>
-          <w:p>
-            <w:pPr>
-              <w:jc w:val="center"/>
-              <w:rPr>
-                <w:b/>
-                <w:bCs/>
-                <w:sz w:val="18"/>
-                <w:szCs w:val="18"/>
-              </w:rPr>
-            </w:pPr>
-          </w:p>
-        </w:tc>
-        <w:tc>
-          <w:tcPr>
-            <w:tcW w:w="1055" w:type="dxa"/>
-          </w:tcPr>
-          <w:p>
-            <w:pPr>
-              <w:jc w:val="center"/>
-              <w:rPr>
-                <w:b/>
-                <w:bCs/>
-                <w:sz w:val="18"/>
-                <w:szCs w:val="18"/>
-              </w:rPr>
-            </w:pPr>
-          </w:p>
-        </w:tc>
-        <w:tc>
-          <w:tcPr>
-            <w:tcW w:w="1187" w:type="dxa"/>
-          </w:tcPr>
-          <w:p>
-            <w:pPr>
-              <w:jc w:val="center"/>
-              <w:rPr>
-                <w:b/>
-                <w:bCs/>
-                <w:sz w:val="18"/>
-                <w:szCs w:val="18"/>
-              </w:rPr>
-            </w:pPr>
-          </w:p>
-        </w:tc>
-        <w:tc>
-          <w:tcPr>
-            <w:tcW w:w="1250" w:type="dxa"/>
-          </w:tcPr>
-          <w:p>
-            <w:pPr>
-              <w:jc w:val="center"/>
-              <w:rPr>
-                <w:b/>
-                <w:bCs/>
-                <w:sz w:val="18"/>
-                <w:szCs w:val="18"/>
-              </w:rPr>
-            </w:pPr>
-          </w:p>
-        </w:tc>
-        <w:tc>
-          <w:tcPr>
-            <w:tcW w:w="2557" w:type="dxa"/>
-          </w:tcPr>
-          <w:p>
-            <w:pPr>
-              <w:jc w:val="center"/>
-              <w:rPr>
-                <w:b/>
-                <w:bCs/>
-                <w:sz w:val="18"/>
-                <w:szCs w:val="18"/>
-              </w:rPr>
-            </w:pPr>
-            <w:r>
-              <w:rPr>
-                <w:b/>
-                <w:bCs/>
-                <w:sz w:val="18"/>
-                <w:szCs w:val="18"/>
-              </w:rPr>
-              <w:t xml:space="preserve">Forme parte de los encargados de toma de decisiones durante el desarrollo de </w:t>
-            </w:r>
-            <w:r>
-              <w:rPr>
-                <w:b/>
-                <w:bCs/>
-                <w:sz w:val="18"/>
-                <w:szCs w:val="18"/>
-              </w:rPr>
-              <w:t>múltiples</w:t>
-            </w:r>
-            <w:r>
-              <w:rPr>
-                <w:b/>
-                <w:bCs/>
-                <w:sz w:val="18"/>
-                <w:szCs w:val="18"/>
-              </w:rPr>
-              <w:t xml:space="preserve"> proyectos de </w:t>
-            </w:r>
-            <w:r>
-              <w:rPr>
-                <w:b/>
-                <w:bCs/>
-                <w:sz w:val="18"/>
-                <w:szCs w:val="18"/>
-              </w:rPr>
-              <w:t>Duoc</w:t>
-            </w:r>
-            <w:r>
-              <w:rPr>
-                <w:b/>
-                <w:bCs/>
-                <w:sz w:val="18"/>
-                <w:szCs w:val="18"/>
-              </w:rPr>
-              <w:t xml:space="preserve"> </w:t>
-            </w:r>
-            <w:r>
-              <w:rPr>
-                <w:b/>
-                <w:bCs/>
-                <w:sz w:val="18"/>
-                <w:szCs w:val="18"/>
-              </w:rPr>
-              <w:t>UC</w:t>
-            </w:r>
-          </w:p>
-        </w:tc>
-      </w:tr>
-      <w:tr>
-        <w:trPr>
-          <w:trHeight w:val="576"/>
-          <w:jc w:val="center"/>
-        </w:trPr>
-        <w:tc>
-          <w:tcPr>
-            <w:tcW w:w="1931" w:type="dxa"/>
-          </w:tcPr>
-          <w:p>
-            <w:pPr>
-              <w:jc w:val="center"/>
-              <w:rPr>
-                <w:sz w:val="20"/>
-                <w:szCs w:val="20"/>
-              </w:rPr>
-            </w:pPr>
-            <w:r>
-              <w:rPr>
-                <w:sz w:val="20"/>
-                <w:szCs w:val="20"/>
-              </w:rPr>
-              <w:t>Desarrollar la transformación de grandes volúmenes de datos para la obtención de información y conocimiento de la organización a fin de apoyar la toma de decisiones y la mejora de los procesos de negocio, de acuerdo a las necesidades de la organización.</w:t>
-            </w:r>
-          </w:p>
-        </w:tc>
-        <w:tc>
-          <w:tcPr>
-            <w:tcW w:w="1017" w:type="dxa"/>
-          </w:tcPr>
-          <w:p>
-            <w:pPr>
-              <w:jc w:val="center"/>
-              <w:rPr>
-                <w:b/>
-                <w:bCs/>
-                <w:sz w:val="18"/>
-                <w:szCs w:val="18"/>
-              </w:rPr>
-            </w:pPr>
-            <w:r>
-              <w:rPr>
-                <w:b/>
-                <w:bCs/>
-                <w:sz w:val="18"/>
-                <w:szCs w:val="18"/>
-              </w:rPr>
-              <w:t>X</w:t>
-            </w:r>
-          </w:p>
-        </w:tc>
-        <w:tc>
-          <w:tcPr>
-            <w:tcW w:w="926" w:type="dxa"/>
-          </w:tcPr>
-          <w:p>
-            <w:pPr>
-              <w:jc w:val="center"/>
-              <w:rPr>
-                <w:b/>
-                <w:bCs/>
-                <w:sz w:val="18"/>
-                <w:szCs w:val="18"/>
-              </w:rPr>
-            </w:pPr>
-          </w:p>
-        </w:tc>
-        <w:tc>
-          <w:tcPr>
-            <w:tcW w:w="1055" w:type="dxa"/>
-          </w:tcPr>
-          <w:p>
-            <w:pPr>
-              <w:jc w:val="center"/>
-              <w:rPr>
-                <w:b/>
-                <w:bCs/>
-                <w:sz w:val="18"/>
-                <w:szCs w:val="18"/>
-              </w:rPr>
-            </w:pPr>
-          </w:p>
-        </w:tc>
-        <w:tc>
-          <w:tcPr>
-            <w:tcW w:w="1187" w:type="dxa"/>
-          </w:tcPr>
-          <w:p>
-            <w:pPr>
-              <w:jc w:val="center"/>
-              <w:rPr>
-                <w:b/>
-                <w:bCs/>
-                <w:sz w:val="18"/>
-                <w:szCs w:val="18"/>
-              </w:rPr>
-            </w:pPr>
-          </w:p>
-        </w:tc>
-        <w:tc>
-          <w:tcPr>
-            <w:tcW w:w="1250" w:type="dxa"/>
-          </w:tcPr>
-          <w:p>
-            <w:pPr>
-              <w:jc w:val="center"/>
-              <w:rPr>
-                <w:b/>
-                <w:bCs/>
-                <w:sz w:val="18"/>
-                <w:szCs w:val="18"/>
-              </w:rPr>
-            </w:pPr>
-          </w:p>
-        </w:tc>
-        <w:tc>
-          <w:tcPr>
-            <w:tcW w:w="2557" w:type="dxa"/>
-          </w:tcPr>
-          <w:p>
-            <w:pPr>
-              <w:jc w:val="center"/>
-              <w:rPr>
-                <w:b/>
-                <w:bCs/>
-                <w:sz w:val="18"/>
-                <w:szCs w:val="18"/>
-              </w:rPr>
-            </w:pPr>
-            <w:r>
-              <w:rPr>
-                <w:b/>
-                <w:bCs/>
-                <w:sz w:val="18"/>
-                <w:szCs w:val="18"/>
-              </w:rPr>
-              <w:t>El data prep y el análisis de datos fue una de las partes más interesantes y que me gustaron de machine learning y sigue llamándome la atención</w:t>
-            </w:r>
-          </w:p>
-        </w:tc>
-      </w:tr>
-      <w:tr>
-        <w:trPr>
-          <w:trHeight w:val="576"/>
-          <w:jc w:val="center"/>
-        </w:trPr>
-        <w:tc>
-          <w:tcPr>
-            <w:tcW w:w="1931" w:type="dxa"/>
-          </w:tcPr>
-          <w:p>
-            <w:pPr>
-              <w:jc w:val="center"/>
-              <w:rPr>
-                <w:sz w:val="20"/>
-                <w:szCs w:val="20"/>
-              </w:rPr>
-            </w:pPr>
-            <w:r>
-              <w:rPr>
-                <w:sz w:val="20"/>
-                <w:szCs w:val="20"/>
-              </w:rPr>
-              <w:t>Resolver situaciones problemáticas de la vida cotidiana, educación superior y mundo laboral, utilizando operaciones básicas con números, expresiones algebraicas, razonamiento matemático básico y formas y espacio, de acuerdo a requerimientos.</w:t>
-            </w:r>
-          </w:p>
-        </w:tc>
-        <w:tc>
-          <w:tcPr>
-            <w:tcW w:w="1017" w:type="dxa"/>
-          </w:tcPr>
-          <w:p>
-            <w:pPr>
-              <w:jc w:val="center"/>
-              <w:rPr>
-                <w:b/>
-                <w:bCs/>
-                <w:sz w:val="18"/>
-                <w:szCs w:val="18"/>
-              </w:rPr>
-            </w:pPr>
-            <w:r>
-              <w:rPr>
-                <w:b/>
-                <w:bCs/>
-                <w:sz w:val="18"/>
-                <w:szCs w:val="18"/>
-              </w:rPr>
-              <w:t>X</w:t>
-            </w:r>
-          </w:p>
-        </w:tc>
-        <w:tc>
-          <w:tcPr>
-            <w:tcW w:w="926" w:type="dxa"/>
-          </w:tcPr>
-          <w:p>
-            <w:pPr>
-              <w:jc w:val="center"/>
-              <w:rPr>
-                <w:b/>
-                <w:bCs/>
-                <w:sz w:val="18"/>
-                <w:szCs w:val="18"/>
-              </w:rPr>
-            </w:pPr>
-          </w:p>
-        </w:tc>
-        <w:tc>
-          <w:tcPr>
-            <w:tcW w:w="1055" w:type="dxa"/>
-          </w:tcPr>
-          <w:p>
-            <w:pPr>
-              <w:jc w:val="center"/>
-              <w:rPr>
-                <w:b/>
-                <w:bCs/>
-                <w:sz w:val="18"/>
-                <w:szCs w:val="18"/>
-              </w:rPr>
-            </w:pPr>
-          </w:p>
-        </w:tc>
-        <w:tc>
-          <w:tcPr>
-            <w:tcW w:w="1187" w:type="dxa"/>
-          </w:tcPr>
-          <w:p>
-            <w:pPr>
-              <w:jc w:val="center"/>
-              <w:rPr>
-                <w:b/>
-                <w:bCs/>
-                <w:sz w:val="18"/>
-                <w:szCs w:val="18"/>
-              </w:rPr>
-            </w:pPr>
-          </w:p>
-        </w:tc>
-        <w:tc>
-          <w:tcPr>
-            <w:tcW w:w="1250" w:type="dxa"/>
-          </w:tcPr>
-          <w:p>
-            <w:pPr>
-              <w:jc w:val="center"/>
-              <w:rPr>
-                <w:b/>
-                <w:bCs/>
-                <w:sz w:val="18"/>
-                <w:szCs w:val="18"/>
-              </w:rPr>
-            </w:pPr>
-          </w:p>
-        </w:tc>
-        <w:tc>
-          <w:tcPr>
-            <w:tcW w:w="2557" w:type="dxa"/>
-          </w:tcPr>
-          <w:p>
-            <w:pPr>
-              <w:jc w:val="center"/>
-              <w:rPr>
-                <w:b/>
-                <w:bCs/>
-                <w:sz w:val="18"/>
-                <w:szCs w:val="18"/>
-              </w:rPr>
-            </w:pPr>
-            <w:r>
-              <w:rPr>
-                <w:b/>
-                <w:bCs/>
-                <w:sz w:val="18"/>
-                <w:szCs w:val="18"/>
-              </w:rPr>
-              <w:t>Durante y de seguro luego de mi vida académica he realizado múltiples programas usando algoritmos matemáticos para calcular o graficas</w:t>
-            </w:r>
-          </w:p>
-        </w:tc>
-      </w:tr>
-      <w:tr>
-        <w:trPr>
-          <w:trHeight w:val="576"/>
-          <w:jc w:val="center"/>
-        </w:trPr>
-        <w:tc>
-          <w:tcPr>
-            <w:tcW w:w="1931" w:type="dxa"/>
-          </w:tcPr>
-          <w:p>
-            <w:pPr>
-              <w:jc w:val="center"/>
-              <w:rPr>
-                <w:sz w:val="20"/>
-                <w:szCs w:val="20"/>
-              </w:rPr>
-            </w:pPr>
-            <w:r>
-              <w:rPr>
-                <w:sz w:val="20"/>
-                <w:szCs w:val="20"/>
-              </w:rPr>
-              <w:t>Resolver situaciones problemáticas de la vida cotidiana, educación superior y mundo laboral, utilizando elementos de las matemáticas discretas y relaciones funcionales, de acuerdo a requerimientos.</w:t>
-            </w:r>
-          </w:p>
-        </w:tc>
-        <w:tc>
-          <w:tcPr>
-            <w:tcW w:w="1017" w:type="dxa"/>
-          </w:tcPr>
-          <w:p>
-            <w:pPr>
-              <w:jc w:val="center"/>
-              <w:rPr>
-                <w:b/>
-                <w:bCs/>
-                <w:sz w:val="18"/>
-                <w:szCs w:val="18"/>
-              </w:rPr>
-            </w:pPr>
-          </w:p>
-        </w:tc>
-        <w:tc>
-          <w:tcPr>
-            <w:tcW w:w="926" w:type="dxa"/>
-          </w:tcPr>
-          <w:p>
-            <w:pPr>
-              <w:jc w:val="center"/>
-              <w:rPr>
-                <w:b/>
-                <w:bCs/>
-                <w:sz w:val="18"/>
-                <w:szCs w:val="18"/>
-              </w:rPr>
-            </w:pPr>
-            <w:r>
-              <w:rPr>
-                <w:b/>
-                <w:bCs/>
-                <w:sz w:val="18"/>
-                <w:szCs w:val="18"/>
-              </w:rPr>
-              <w:t>X</w:t>
-            </w:r>
-          </w:p>
-        </w:tc>
-        <w:tc>
-          <w:tcPr>
-            <w:tcW w:w="1055" w:type="dxa"/>
-          </w:tcPr>
-          <w:p>
-            <w:pPr>
-              <w:jc w:val="center"/>
-              <w:rPr>
-                <w:b/>
-                <w:bCs/>
-                <w:sz w:val="18"/>
-                <w:szCs w:val="18"/>
-              </w:rPr>
-            </w:pPr>
-          </w:p>
-        </w:tc>
-        <w:tc>
-          <w:tcPr>
-            <w:tcW w:w="1187" w:type="dxa"/>
-          </w:tcPr>
-          <w:p>
-            <w:pPr>
-              <w:jc w:val="center"/>
-              <w:rPr>
-                <w:b/>
-                <w:bCs/>
-                <w:sz w:val="18"/>
-                <w:szCs w:val="18"/>
-              </w:rPr>
-            </w:pPr>
-          </w:p>
-        </w:tc>
-        <w:tc>
-          <w:tcPr>
-            <w:tcW w:w="1250" w:type="dxa"/>
-          </w:tcPr>
-          <w:p>
-            <w:pPr>
-              <w:jc w:val="center"/>
-              <w:rPr>
-                <w:b/>
-                <w:bCs/>
-                <w:sz w:val="18"/>
-                <w:szCs w:val="18"/>
-              </w:rPr>
-            </w:pPr>
-          </w:p>
-        </w:tc>
-        <w:tc>
-          <w:tcPr>
-            <w:tcW w:w="2557" w:type="dxa"/>
-          </w:tcPr>
-          <w:p>
-            <w:pPr>
-              <w:jc w:val="center"/>
-              <w:rPr>
-                <w:b/>
-                <w:bCs/>
-                <w:sz w:val="18"/>
-                <w:szCs w:val="18"/>
-              </w:rPr>
-            </w:pPr>
-            <w:r>
-              <w:rPr>
-                <w:b/>
-                <w:bCs/>
-                <w:sz w:val="18"/>
-                <w:szCs w:val="18"/>
-              </w:rPr>
-              <w:t>El uso de las matemáticas discretas es más reducido, pero no menos comprendido durante mi desarrollo de proyectos</w:t>
-            </w:r>
-          </w:p>
-        </w:tc>
-      </w:tr>
-      <w:tr>
-        <w:trPr>
-          <w:trHeight w:val="576"/>
-          <w:jc w:val="center"/>
-        </w:trPr>
-        <w:tc>
-          <w:tcPr>
-            <w:tcW w:w="1931" w:type="dxa"/>
-          </w:tcPr>
-          <w:p>
-            <w:pPr>
-              <w:jc w:val="center"/>
-              <w:rPr>
-                <w:sz w:val="20"/>
-                <w:szCs w:val="20"/>
-              </w:rPr>
-            </w:pPr>
-            <w:r>
-              <w:rPr>
-                <w:sz w:val="20"/>
-                <w:szCs w:val="20"/>
-              </w:rPr>
-              <w:t xml:space="preserve">Resolver situaciones problemáticas de la educación superior y mundo laboral, utilizando elementos de la estadística descriptiva, de </w:t>
-            </w:r>
-            <w:r>
-              <w:rPr>
-                <w:sz w:val="20"/>
-                <w:szCs w:val="20"/>
-              </w:rPr>
-              <w:lastRenderedPageBreak/>
-              <w:t>acuerdo a requerimientos.</w:t>
-            </w:r>
-          </w:p>
-        </w:tc>
-        <w:tc>
-          <w:tcPr>
-            <w:tcW w:w="1017" w:type="dxa"/>
-          </w:tcPr>
-          <w:p>
-            <w:pPr>
-              <w:jc w:val="center"/>
-              <w:rPr>
-                <w:b/>
-                <w:bCs/>
-                <w:sz w:val="18"/>
-                <w:szCs w:val="18"/>
-              </w:rPr>
-            </w:pPr>
-            <w:r>
-              <w:rPr>
-                <w:b/>
-                <w:bCs/>
-                <w:sz w:val="18"/>
-                <w:szCs w:val="18"/>
-              </w:rPr>
-              <w:lastRenderedPageBreak/>
-              <w:t>X</w:t>
-            </w:r>
-          </w:p>
-        </w:tc>
-        <w:tc>
-          <w:tcPr>
-            <w:tcW w:w="926" w:type="dxa"/>
-          </w:tcPr>
-          <w:p>
-            <w:pPr>
-              <w:jc w:val="center"/>
-              <w:rPr>
-                <w:b/>
-                <w:bCs/>
-                <w:sz w:val="18"/>
-                <w:szCs w:val="18"/>
-              </w:rPr>
-            </w:pPr>
-          </w:p>
-        </w:tc>
-        <w:tc>
-          <w:tcPr>
-            <w:tcW w:w="1055" w:type="dxa"/>
-          </w:tcPr>
-          <w:p>
-            <w:pPr>
-              <w:jc w:val="center"/>
-              <w:rPr>
-                <w:b/>
-                <w:bCs/>
-                <w:sz w:val="18"/>
-                <w:szCs w:val="18"/>
-              </w:rPr>
-            </w:pPr>
-          </w:p>
-        </w:tc>
-        <w:tc>
-          <w:tcPr>
-            <w:tcW w:w="1187" w:type="dxa"/>
-          </w:tcPr>
-          <w:p>
-            <w:pPr>
-              <w:jc w:val="center"/>
-              <w:rPr>
-                <w:b/>
-                <w:bCs/>
-                <w:sz w:val="18"/>
-                <w:szCs w:val="18"/>
-              </w:rPr>
-            </w:pPr>
-          </w:p>
-        </w:tc>
-        <w:tc>
-          <w:tcPr>
-            <w:tcW w:w="1250" w:type="dxa"/>
-          </w:tcPr>
-          <w:p>
-            <w:pPr>
-              <w:jc w:val="center"/>
-              <w:rPr>
-                <w:b/>
-                <w:bCs/>
-                <w:sz w:val="18"/>
-                <w:szCs w:val="18"/>
-              </w:rPr>
-            </w:pPr>
-          </w:p>
-        </w:tc>
-        <w:tc>
-          <w:tcPr>
-            <w:tcW w:w="2557" w:type="dxa"/>
-          </w:tcPr>
-          <w:p>
-            <w:pPr>
-              <w:jc w:val="center"/>
-              <w:rPr>
-                <w:b/>
-                <w:bCs/>
-                <w:sz w:val="18"/>
-                <w:szCs w:val="18"/>
-              </w:rPr>
-            </w:pPr>
-            <w:r>
-              <w:rPr>
-                <w:b/>
-                <w:bCs/>
-                <w:sz w:val="18"/>
-                <w:szCs w:val="18"/>
-              </w:rPr>
-              <w:t xml:space="preserve">Las estadísticas descriptivas han sido las matemáticas más utilizadas durante mi aprendizaje dentro de la </w:t>
-            </w:r>
-            <w:r>
-              <w:rPr>
-                <w:b/>
-                <w:bCs/>
-                <w:sz w:val="18"/>
-                <w:szCs w:val="18"/>
-              </w:rPr>
-              <w:t>gr</w:t>
-            </w:r>
-            <w:r>
-              <w:rPr>
-                <w:b/>
-                <w:bCs/>
-                <w:sz w:val="18"/>
-                <w:szCs w:val="18"/>
-              </w:rPr>
-              <w:t xml:space="preserve">aficación y análisis de grandes datos de </w:t>
-            </w:r>
-            <w:r>
-              <w:rPr>
-                <w:b/>
-                <w:bCs/>
-                <w:sz w:val="18"/>
-                <w:szCs w:val="18"/>
-              </w:rPr>
-              <w:t>información</w:t>
-            </w:r>
-          </w:p>
-        </w:tc>
-      </w:tr>
-      <w:tr>
-        <w:trPr>
-          <w:trHeight w:val="576"/>
-          <w:jc w:val="center"/>
-        </w:trPr>
-        <w:tc>
-          <w:tcPr>
-            <w:tcW w:w="1931" w:type="dxa"/>
-          </w:tcPr>
-          <w:p>
-            <w:pPr>
-              <w:jc w:val="center"/>
-              <w:rPr>
-                <w:sz w:val="20"/>
-                <w:szCs w:val="20"/>
-              </w:rPr>
-            </w:pPr>
-            <w:r>
-              <w:rPr>
-                <w:sz w:val="20"/>
-                <w:szCs w:val="20"/>
-              </w:rPr>
-              <w:t>Comunicar en forma oral o escrita, aplicando herramientas lingüístico-pragmáticas y estrategias de comprensión que permiten la solución de problemas comunicativos en los contextos académicos, de acuerdo al marco común de referencia de las lenguas.</w:t>
-            </w:r>
-          </w:p>
-        </w:tc>
-        <w:tc>
-          <w:tcPr>
-            <w:tcW w:w="1017" w:type="dxa"/>
-          </w:tcPr>
-          <w:p>
-            <w:pPr>
-              <w:jc w:val="center"/>
-              <w:rPr>
-                <w:b/>
-                <w:bCs/>
-                <w:sz w:val="18"/>
-                <w:szCs w:val="18"/>
-              </w:rPr>
-            </w:pPr>
-            <w:r>
-              <w:rPr>
-                <w:b/>
-                <w:bCs/>
-                <w:sz w:val="18"/>
-                <w:szCs w:val="18"/>
-              </w:rPr>
-              <w:t>X</w:t>
-            </w:r>
-          </w:p>
-        </w:tc>
-        <w:tc>
-          <w:tcPr>
-            <w:tcW w:w="926" w:type="dxa"/>
-          </w:tcPr>
-          <w:p>
-            <w:pPr>
-              <w:jc w:val="center"/>
-              <w:rPr>
-                <w:b/>
-                <w:bCs/>
-                <w:sz w:val="18"/>
-                <w:szCs w:val="18"/>
-              </w:rPr>
-            </w:pPr>
-          </w:p>
-        </w:tc>
-        <w:tc>
-          <w:tcPr>
-            <w:tcW w:w="1055" w:type="dxa"/>
-          </w:tcPr>
-          <w:p>
-            <w:pPr>
-              <w:jc w:val="center"/>
-              <w:rPr>
-                <w:b/>
-                <w:bCs/>
-                <w:sz w:val="18"/>
-                <w:szCs w:val="18"/>
-              </w:rPr>
-            </w:pPr>
-          </w:p>
-        </w:tc>
-        <w:tc>
-          <w:tcPr>
-            <w:tcW w:w="1187" w:type="dxa"/>
-          </w:tcPr>
-          <w:p>
-            <w:pPr>
-              <w:jc w:val="center"/>
-              <w:rPr>
-                <w:b/>
-                <w:bCs/>
-                <w:sz w:val="18"/>
-                <w:szCs w:val="18"/>
-              </w:rPr>
-            </w:pPr>
-          </w:p>
-        </w:tc>
-        <w:tc>
-          <w:tcPr>
-            <w:tcW w:w="1250" w:type="dxa"/>
-          </w:tcPr>
-          <w:p>
-            <w:pPr>
-              <w:jc w:val="center"/>
-              <w:rPr>
-                <w:b/>
-                <w:bCs/>
-                <w:sz w:val="18"/>
-                <w:szCs w:val="18"/>
-              </w:rPr>
-            </w:pPr>
-          </w:p>
-        </w:tc>
-        <w:tc>
-          <w:tcPr>
-            <w:tcW w:w="2557" w:type="dxa"/>
-          </w:tcPr>
-          <w:p>
-            <w:pPr>
-              <w:jc w:val="center"/>
-              <w:rPr>
-                <w:b/>
-                <w:bCs/>
-                <w:sz w:val="18"/>
-                <w:szCs w:val="18"/>
-              </w:rPr>
-            </w:pPr>
-            <w:r>
-              <w:rPr>
-                <w:b/>
-                <w:bCs/>
-                <w:sz w:val="18"/>
-                <w:szCs w:val="18"/>
-              </w:rPr>
-              <w:t xml:space="preserve">Siempre he mantenido un estándar alto en mi forma de comunicarme de manera </w:t>
-            </w:r>
-            <w:r>
-              <w:rPr>
-                <w:b/>
-                <w:bCs/>
-                <w:sz w:val="18"/>
-                <w:szCs w:val="18"/>
-              </w:rPr>
-              <w:t>académica</w:t>
-            </w:r>
-            <w:r>
-              <w:rPr>
-                <w:b/>
-                <w:bCs/>
-                <w:sz w:val="18"/>
-                <w:szCs w:val="18"/>
-              </w:rPr>
-              <w:t>/labora</w:t>
-            </w:r>
-          </w:p>
-        </w:tc>
-      </w:tr>
-      <w:tr>
-        <w:trPr>
-          <w:trHeight w:val="576"/>
-          <w:jc w:val="center"/>
-        </w:trPr>
-        <w:tc>
-          <w:tcPr>
-            <w:tcW w:w="1931" w:type="dxa"/>
-          </w:tcPr>
-          <w:p>
-            <w:pPr>
-              <w:jc w:val="center"/>
-              <w:rPr>
-                <w:sz w:val="20"/>
-                <w:szCs w:val="20"/>
-              </w:rPr>
-            </w:pPr>
-            <w:r>
-              <w:rPr>
-                <w:sz w:val="20"/>
-                <w:szCs w:val="20"/>
-              </w:rPr>
-              <w:t>Comunicarse de forma oral y escrita usando el idioma inglés en situaciones socio-laborales a un nivel intermedio, según la Tabla de Competencias TOEIC y CEFR.</w:t>
-            </w:r>
-          </w:p>
-        </w:tc>
-        <w:tc>
-          <w:tcPr>
-            <w:tcW w:w="1017" w:type="dxa"/>
-          </w:tcPr>
-          <w:p>
-            <w:pPr>
-              <w:jc w:val="center"/>
-              <w:rPr>
-                <w:b/>
-                <w:bCs/>
-                <w:sz w:val="18"/>
-                <w:szCs w:val="18"/>
-              </w:rPr>
-            </w:pPr>
-            <w:r>
-              <w:rPr>
-                <w:b/>
-                <w:bCs/>
-                <w:sz w:val="18"/>
-                <w:szCs w:val="18"/>
-              </w:rPr>
-              <w:t>X</w:t>
-            </w:r>
-          </w:p>
-        </w:tc>
-        <w:tc>
-          <w:tcPr>
-            <w:tcW w:w="926" w:type="dxa"/>
-          </w:tcPr>
-          <w:p>
-            <w:pPr>
-              <w:jc w:val="center"/>
-              <w:rPr>
-                <w:b/>
-                <w:bCs/>
-                <w:sz w:val="18"/>
-                <w:szCs w:val="18"/>
-              </w:rPr>
-            </w:pPr>
-          </w:p>
-        </w:tc>
-        <w:tc>
-          <w:tcPr>
-            <w:tcW w:w="1055" w:type="dxa"/>
-          </w:tcPr>
-          <w:p>
-            <w:pPr>
-              <w:jc w:val="center"/>
-              <w:rPr>
-                <w:b/>
-                <w:bCs/>
-                <w:sz w:val="18"/>
-                <w:szCs w:val="18"/>
-              </w:rPr>
-            </w:pPr>
-          </w:p>
-        </w:tc>
-        <w:tc>
-          <w:tcPr>
-            <w:tcW w:w="1187" w:type="dxa"/>
-          </w:tcPr>
-          <w:p>
-            <w:pPr>
-              <w:jc w:val="center"/>
-              <w:rPr>
-                <w:b/>
-                <w:bCs/>
-                <w:sz w:val="18"/>
-                <w:szCs w:val="18"/>
-              </w:rPr>
-            </w:pPr>
-          </w:p>
-        </w:tc>
-        <w:tc>
-          <w:tcPr>
-            <w:tcW w:w="1250" w:type="dxa"/>
-          </w:tcPr>
-          <w:p>
-            <w:pPr>
-              <w:jc w:val="center"/>
-              <w:rPr>
-                <w:b/>
-                <w:bCs/>
-                <w:sz w:val="18"/>
-                <w:szCs w:val="18"/>
-              </w:rPr>
-            </w:pPr>
-          </w:p>
-        </w:tc>
-        <w:tc>
-          <w:tcPr>
-            <w:tcW w:w="2557" w:type="dxa"/>
-          </w:tcPr>
-          <w:p>
-            <w:pPr>
-              <w:rPr>
-                <w:b/>
-                <w:bCs/>
-                <w:sz w:val="18"/>
-                <w:szCs w:val="18"/>
-              </w:rPr>
-            </w:pPr>
-            <w:r>
-              <w:rPr>
-                <w:b/>
-                <w:bCs/>
-                <w:sz w:val="18"/>
-                <w:szCs w:val="18"/>
-              </w:rPr>
-              <w:t>Soy certificado con un puntaje casi perfecto en la prueba toeic y se comunicarme por todos los medios del lenguaje ingles</w:t>
-            </w:r>
-          </w:p>
-        </w:tc>
-      </w:tr>
-      <w:tr>
-        <w:trPr>
-          <w:trHeight w:val="576"/>
-          <w:jc w:val="center"/>
-        </w:trPr>
-        <w:tc>
-          <w:tcPr>
-            <w:tcW w:w="1931" w:type="dxa"/>
-          </w:tcPr>
-          <w:p>
-            <w:pPr>
-              <w:jc w:val="center"/>
-              <w:rPr>
-                <w:sz w:val="20"/>
-                <w:szCs w:val="20"/>
-              </w:rPr>
-            </w:pPr>
-            <w:r>
-              <w:rPr>
-                <w:sz w:val="20"/>
-                <w:szCs w:val="20"/>
-              </w:rPr>
-              <w:t>Comunicarse usando el idioma inglés en situaciones laborales a un nivel intermedio relacionado con su área de especialización, según la Tabla de Competencias TOEIC y CEFR.</w:t>
-            </w:r>
-          </w:p>
-        </w:tc>
-        <w:tc>
-          <w:tcPr>
-            <w:tcW w:w="1017" w:type="dxa"/>
-          </w:tcPr>
-          <w:p>
-            <w:pPr>
-              <w:jc w:val="center"/>
-              <w:rPr>
-                <w:b/>
-                <w:bCs/>
-                <w:sz w:val="18"/>
-                <w:szCs w:val="18"/>
-              </w:rPr>
-            </w:pPr>
-            <w:r>
-              <w:rPr>
-                <w:b/>
-                <w:bCs/>
-                <w:sz w:val="18"/>
-                <w:szCs w:val="18"/>
-              </w:rPr>
-              <w:t>X</w:t>
-            </w:r>
-          </w:p>
-        </w:tc>
-        <w:tc>
-          <w:tcPr>
-            <w:tcW w:w="926" w:type="dxa"/>
-          </w:tcPr>
-          <w:p>
-            <w:pPr>
-              <w:jc w:val="center"/>
-              <w:rPr>
-                <w:b/>
-                <w:bCs/>
-                <w:sz w:val="18"/>
-                <w:szCs w:val="18"/>
-              </w:rPr>
-            </w:pPr>
-          </w:p>
-        </w:tc>
-        <w:tc>
-          <w:tcPr>
-            <w:tcW w:w="1055" w:type="dxa"/>
-          </w:tcPr>
-          <w:p>
-            <w:pPr>
-              <w:jc w:val="center"/>
-              <w:rPr>
-                <w:b/>
-                <w:bCs/>
-                <w:sz w:val="18"/>
-                <w:szCs w:val="18"/>
-              </w:rPr>
-            </w:pPr>
-          </w:p>
-        </w:tc>
-        <w:tc>
-          <w:tcPr>
-            <w:tcW w:w="1187" w:type="dxa"/>
-          </w:tcPr>
-          <w:p>
-            <w:pPr>
-              <w:jc w:val="center"/>
-              <w:rPr>
-                <w:b/>
-                <w:bCs/>
-                <w:sz w:val="18"/>
-                <w:szCs w:val="18"/>
-              </w:rPr>
-            </w:pPr>
-          </w:p>
-        </w:tc>
-        <w:tc>
-          <w:tcPr>
-            <w:tcW w:w="1250" w:type="dxa"/>
-          </w:tcPr>
-          <w:p>
-            <w:pPr>
-              <w:jc w:val="center"/>
-              <w:rPr>
-                <w:b/>
-                <w:bCs/>
-                <w:sz w:val="18"/>
-                <w:szCs w:val="18"/>
-              </w:rPr>
-            </w:pPr>
-          </w:p>
-        </w:tc>
-        <w:tc>
-          <w:tcPr>
-            <w:tcW w:w="2557" w:type="dxa"/>
-          </w:tcPr>
-          <w:p>
-            <w:pPr>
-              <w:jc w:val="center"/>
-              <w:rPr>
-                <w:b/>
-                <w:bCs/>
-                <w:sz w:val="18"/>
-                <w:szCs w:val="18"/>
-              </w:rPr>
-            </w:pPr>
-            <w:r>
-              <w:rPr>
-                <w:b/>
-                <w:bCs/>
-                <w:sz w:val="18"/>
-                <w:szCs w:val="18"/>
-              </w:rPr>
-              <w:t>Soy certificado con un puntaje casi perfecto en la prueba toeic y se comunicarme por todos los medios del lenguaje ingles</w:t>
-            </w:r>
-          </w:p>
-        </w:tc>
-      </w:tr>
-      <w:tr>
-        <w:trPr>
-          <w:trHeight w:val="576"/>
-          <w:jc w:val="center"/>
-        </w:trPr>
-        <w:tc>
-          <w:tcPr>
-            <w:tcW w:w="1931" w:type="dxa"/>
-          </w:tcPr>
-          <w:p>
-            <w:pPr>
-              <w:spacing w:before="100" w:beforeAutospacing="1" w:after="100" w:afterAutospacing="1"/>
-              <w:rPr>
-                <w:rFonts w:eastAsia="Times New Roman" w:cstheme="minorHAnsi"/>
-                <w:sz w:val="20"/>
-                <w:szCs w:val="20"/>
-                <w:lang w:eastAsia="es-CL"/>
-              </w:rPr>
-            </w:pPr>
-            <w:r>
-              <w:rPr>
-                <w:rFonts w:eastAsia="Times New Roman" w:cstheme="minorHAnsi"/>
-                <w:sz w:val="20"/>
-                <w:szCs w:val="20"/>
-                <w:lang w:eastAsia="es-CL"/>
-              </w:rPr>
-              <w:t xml:space="preserve">Desarrollar la propia habilidad emprendedora, a través de experiencias en el ámbito de la especialidad. Elaborar proyectos innovadores que agreguen valor a contextos sociales y </w:t>
-            </w:r>
-            <w:r>
-              <w:rPr>
-                <w:rFonts w:eastAsia="Times New Roman" w:cstheme="minorHAnsi"/>
-                <w:sz w:val="20"/>
-                <w:szCs w:val="20"/>
-                <w:lang w:eastAsia="es-CL"/>
-              </w:rPr>
-              <w:lastRenderedPageBreak/>
-              <w:t>productivos, de acuerdo a las</w:t>
-            </w:r>
-          </w:p>
-          <w:p>
-            <w:pPr>
-              <w:spacing w:before="100" w:beforeAutospacing="1" w:after="100" w:afterAutospacing="1"/>
-              <w:rPr>
-                <w:rFonts w:eastAsia="Times New Roman" w:cstheme="minorHAnsi"/>
-                <w:sz w:val="20"/>
-                <w:szCs w:val="20"/>
-                <w:lang w:eastAsia="es-CL"/>
-              </w:rPr>
-            </w:pPr>
-            <w:r>
-              <w:rPr>
-                <w:rFonts w:eastAsia="Times New Roman" w:cstheme="minorHAnsi"/>
-                <w:sz w:val="20"/>
-                <w:szCs w:val="20"/>
-                <w:lang w:eastAsia="es-CL"/>
-              </w:rPr>
-              <w:t>necesidades del entorno.</w:t>
-            </w:r>
-          </w:p>
-          <w:p>
-            <w:pPr>
-              <w:jc w:val="center"/>
-              <w:rPr>
-                <w:rFonts w:cstheme="minorHAnsi"/>
-                <w:sz w:val="20"/>
-                <w:szCs w:val="20"/>
-              </w:rPr>
-            </w:pPr>
-          </w:p>
-        </w:tc>
-        <w:tc>
-          <w:tcPr>
-            <w:tcW w:w="1017" w:type="dxa"/>
-          </w:tcPr>
-          <w:p>
-            <w:pPr>
-              <w:jc w:val="center"/>
-              <w:rPr>
-                <w:b/>
-                <w:bCs/>
-                <w:sz w:val="18"/>
-                <w:szCs w:val="18"/>
-              </w:rPr>
-            </w:pPr>
-            <w:r>
-              <w:rPr>
-                <w:b/>
-                <w:bCs/>
-                <w:sz w:val="18"/>
-                <w:szCs w:val="18"/>
-              </w:rPr>
-              <w:lastRenderedPageBreak/>
-              <w:t>X</w:t>
-            </w:r>
-          </w:p>
-        </w:tc>
-        <w:tc>
-          <w:tcPr>
-            <w:tcW w:w="926" w:type="dxa"/>
-          </w:tcPr>
-          <w:p>
-            <w:pPr>
-              <w:jc w:val="center"/>
-              <w:rPr>
-                <w:b/>
-                <w:bCs/>
-                <w:sz w:val="18"/>
-                <w:szCs w:val="18"/>
-              </w:rPr>
-            </w:pPr>
-          </w:p>
-        </w:tc>
-        <w:tc>
-          <w:tcPr>
-            <w:tcW w:w="1055" w:type="dxa"/>
-          </w:tcPr>
-          <w:p>
-            <w:pPr>
-              <w:jc w:val="center"/>
-              <w:rPr>
-                <w:b/>
-                <w:bCs/>
-                <w:sz w:val="18"/>
-                <w:szCs w:val="18"/>
-              </w:rPr>
-            </w:pPr>
-          </w:p>
-        </w:tc>
-        <w:tc>
-          <w:tcPr>
-            <w:tcW w:w="1187" w:type="dxa"/>
-          </w:tcPr>
-          <w:p>
-            <w:pPr>
-              <w:jc w:val="center"/>
-              <w:rPr>
-                <w:b/>
-                <w:bCs/>
-                <w:sz w:val="18"/>
-                <w:szCs w:val="18"/>
-              </w:rPr>
-            </w:pPr>
-          </w:p>
-        </w:tc>
-        <w:tc>
-          <w:tcPr>
-            <w:tcW w:w="1250" w:type="dxa"/>
-          </w:tcPr>
-          <w:p>
-            <w:pPr>
-              <w:jc w:val="center"/>
-              <w:rPr>
-                <w:b/>
-                <w:bCs/>
-                <w:sz w:val="18"/>
-                <w:szCs w:val="18"/>
-              </w:rPr>
-            </w:pPr>
-          </w:p>
-        </w:tc>
-        <w:tc>
-          <w:tcPr>
-            <w:tcW w:w="2557" w:type="dxa"/>
-          </w:tcPr>
-          <w:p>
-            <w:pPr>
-              <w:jc w:val="center"/>
-              <w:rPr>
-                <w:b/>
-                <w:bCs/>
-                <w:sz w:val="18"/>
-                <w:szCs w:val="18"/>
-              </w:rPr>
-            </w:pPr>
-            <w:r>
-              <w:rPr>
-                <w:b/>
-                <w:bCs/>
-                <w:sz w:val="18"/>
-                <w:szCs w:val="18"/>
-              </w:rPr>
-              <w:t>Siempre he tenido las ganas y el deseo de desarrollar proyectos a mi voluntad y querer</w:t>
-            </w:r>
-          </w:p>
-        </w:tc>
-      </w:tr>
-      <w:tr>
-        <w:trPr>
-          <w:trHeight w:val="576"/>
-          <w:jc w:val="center"/>
-        </w:trPr>
-        <w:tc>
-          <w:tcPr>
-            <w:tcW w:w="1931" w:type="dxa"/>
-          </w:tcPr>
-          <w:p>
-            <w:pPr>
-              <w:jc w:val="center"/>
-              <w:rPr>
-                <w:sz w:val="20"/>
-                <w:szCs w:val="20"/>
-              </w:rPr>
-            </w:pPr>
-            <w:r>
-              <w:rPr>
-                <w:sz w:val="20"/>
-                <w:szCs w:val="20"/>
-              </w:rPr>
-              <w:t>Reconocer un desempeño correcto en situaciones de la profesión o especialidad en el área de la informática.</w:t>
-            </w:r>
-          </w:p>
-        </w:tc>
-        <w:tc>
-          <w:tcPr>
-            <w:tcW w:w="1017" w:type="dxa"/>
-          </w:tcPr>
-          <w:p>
-            <w:pPr>
-              <w:jc w:val="center"/>
-              <w:rPr>
-                <w:b/>
-                <w:bCs/>
-                <w:sz w:val="18"/>
-                <w:szCs w:val="18"/>
-              </w:rPr>
-            </w:pPr>
-            <w:r>
-              <w:rPr>
-                <w:b/>
-                <w:bCs/>
-                <w:sz w:val="18"/>
-                <w:szCs w:val="18"/>
-              </w:rPr>
-              <w:t>X</w:t>
-            </w:r>
-          </w:p>
-        </w:tc>
-        <w:tc>
-          <w:tcPr>
-            <w:tcW w:w="926" w:type="dxa"/>
-          </w:tcPr>
-          <w:p>
-            <w:pPr>
-              <w:jc w:val="center"/>
-              <w:rPr>
-                <w:b/>
-                <w:bCs/>
-                <w:sz w:val="18"/>
-                <w:szCs w:val="18"/>
-              </w:rPr>
-            </w:pPr>
-          </w:p>
-        </w:tc>
-        <w:tc>
-          <w:tcPr>
-            <w:tcW w:w="1055" w:type="dxa"/>
-          </w:tcPr>
-          <w:p>
-            <w:pPr>
-              <w:jc w:val="center"/>
-              <w:rPr>
-                <w:b/>
-                <w:bCs/>
-                <w:sz w:val="18"/>
-                <w:szCs w:val="18"/>
-              </w:rPr>
-            </w:pPr>
-          </w:p>
-        </w:tc>
-        <w:tc>
-          <w:tcPr>
-            <w:tcW w:w="1187" w:type="dxa"/>
-          </w:tcPr>
-          <w:p>
-            <w:pPr>
-              <w:jc w:val="center"/>
-              <w:rPr>
-                <w:b/>
-                <w:bCs/>
-                <w:sz w:val="18"/>
-                <w:szCs w:val="18"/>
-              </w:rPr>
-            </w:pPr>
-          </w:p>
-        </w:tc>
-        <w:tc>
-          <w:tcPr>
-            <w:tcW w:w="1250" w:type="dxa"/>
-          </w:tcPr>
-          <w:p>
-            <w:pPr>
-              <w:jc w:val="center"/>
-              <w:rPr>
-                <w:b/>
-                <w:bCs/>
-                <w:sz w:val="18"/>
-                <w:szCs w:val="18"/>
-              </w:rPr>
-            </w:pPr>
-          </w:p>
-        </w:tc>
-        <w:tc>
-          <w:tcPr>
-            <w:tcW w:w="2557" w:type="dxa"/>
-          </w:tcPr>
-          <w:p>
-            <w:pPr>
-              <w:jc w:val="center"/>
-              <w:rPr>
-                <w:b/>
-                <w:bCs/>
-                <w:sz w:val="18"/>
-                <w:szCs w:val="18"/>
-              </w:rPr>
-            </w:pPr>
-            <w:r>
-              <w:rPr>
-                <w:b/>
-                <w:bCs/>
-                <w:sz w:val="18"/>
-                <w:szCs w:val="18"/>
-              </w:rPr>
-              <w:t>Me considero una persona bastante profesional e integra dentro de todas las oportunidades laborales/aprendizaje que se me han presentado</w:t>
+              <w:t xml:space="preserve"> de SITRAC-ANCI, aunque el proyecto en sí no incluye un componente móvil, por lo que en ese frente específico esta competencia no se pone en práctica de forma directa pero sí la manejo por experiencia previa.</w:t>
             </w:r>
           </w:p>
         </w:tc>
@@ -4256,7 +2256,7 @@
 </file>
 
 <file path=word/endnotes.xml><?xml version="1.0" encoding="utf-8"?>
-<w:endnotes xmlns:wpc="http://schemas.microsoft.com/office/word/2010/wordprocessingCanvas" xmlns:cx="http://schemas.microsoft.com/office/drawing/2014/chartex" xmlns:cx1="http://schemas.microsoft.com/office/drawing/2015/9/8/chartex" xmlns:cx2="http://schemas.microsoft.com/office/drawing/2015/10/21/chartex" xmlns:cx3="http://schemas.microsoft.com/office/drawing/2016/5/9/chartex" xmlns:cx4="http://schemas.microsoft.com/office/drawing/2016/5/10/chartex" xmlns:cx5="http://schemas.microsoft.com/office/drawing/2016/5/11/chartex" xmlns:cx6="http://schemas.microsoft.com/office/drawing/2016/5/12/chartex" xmlns:cx7="http://schemas.microsoft.com/office/drawing/2016/5/13/chartex" xmlns:cx8="http://schemas.microsoft.com/office/drawing/2016/5/14/chartex" xmlns:mc="http://schemas.openxmlformats.org/markup-compatibility/2006" xmlns:aink="http://schemas.microsoft.com/office/drawing/2016/ink" xmlns:am3d="http://schemas.microsoft.com/office/drawing/2017/model3d" xmlns:o="urn:schemas-microsoft-com:office:office" xmlns:r="http://schemas.openxmlformats.org/officeDocument/2006/relationships" xmlns:m="http://schemas.openxmlformats.org/officeDocument/2006/math" xmlns:v="urn:schemas-microsoft-com:vml" xmlns:wp14="http://schemas.microsoft.com/office/word/2010/wordprocessingDrawing" xmlns:wp="http://schemas.openxmlformats.org/drawingml/2006/wordprocessingDrawing" xmlns:w10="urn:schemas-microsoft-com:office:word" xmlns:w="http://schemas.openxmlformats.org/wordprocessingml/2006/main" xmlns:w14="http://schemas.microsoft.com/office/word/2010/wordml" xmlns:w15="http://schemas.microsoft.com/office/word/2012/wordml" xmlns:w16cex="http://schemas.microsoft.com/office/word/2018/wordml/cex" xmlns:w16cid="http://schemas.microsoft.com/office/word/2016/wordml/cid" xmlns:w16="http://schemas.microsoft.com/office/word/2018/wordml" xmlns:w16sdtdh="http://schemas.microsoft.com/office/word/2020/wordml/sdtdatahash" xmlns:w16se="http://schemas.microsoft.com/office/word/2015/wordml/symex" xmlns:wpg="http://schemas.microsoft.com/office/word/2010/wordprocessingGroup" xmlns:wpi="http://schemas.microsoft.com/office/word/2010/wordprocessingInk" xmlns:wne="http://schemas.microsoft.com/office/word/2006/wordml" xmlns:wps="http://schemas.microsoft.com/office/word/2010/wordprocessingShape" mc:Ignorable="w14 w15 w16se w16cid w16 w16cex w16sdtdh wp14">
+<w:endnotes xmlns:wpc="http://schemas.microsoft.com/office/word/2010/wordprocessingCanvas" xmlns:cx="http://schemas.microsoft.com/office/drawing/2014/chartex" xmlns:cx1="http://schemas.microsoft.com/office/drawing/2015/9/8/chartex" xmlns:cx2="http://schemas.microsoft.com/office/drawing/2015/10/21/chartex" xmlns:cx3="http://schemas.microsoft.com/office/drawing/2016/5/9/chartex" xmlns:cx4="http://schemas.microsoft.com/office/drawing/2016/5/10/chartex" xmlns:cx5="http://schemas.microsoft.com/office/drawing/2016/5/11/chartex" xmlns:cx6="http://schemas.microsoft.com/office/drawing/2016/5/12/chartex" xmlns:cx7="http://schemas.microsoft.com/office/drawing/2016/5/13/chartex" xmlns:cx8="http://schemas.microsoft.com/office/drawing/2016/5/14/chartex" xmlns:mc="http://schemas.openxmlformats.org/markup-compatibility/2006" xmlns:aink="http://schemas.microsoft.com/office/drawing/2016/ink" xmlns:am3d="http://schemas.microsoft.com/office/drawing/2017/model3d" xmlns:o="urn:schemas-microsoft-com:office:office" xmlns:oel="http://schemas.microsoft.com/office/2019/extlst" xmlns:r="http://schemas.openxmlformats.org/officeDocument/2006/relationships" xmlns:m="http://schemas.openxmlformats.org/officeDocument/2006/math" xmlns:v="urn:schemas-microsoft-com:vml" xmlns:wp14="http://schemas.microsoft.com/office/word/2010/wordprocessingDrawing" xmlns:wp="http://schemas.openxmlformats.org/drawingml/2006/wordprocessingDrawing" xmlns:w10="urn:schemas-microsoft-com:office:word" xmlns:w="http://schemas.openxmlformats.org/wordprocessingml/2006/main" xmlns:w14="http://schemas.microsoft.com/office/word/2010/wordml" xmlns:w15="http://schemas.microsoft.com/office/word/2012/wordml" xmlns:w16cex="http://schemas.microsoft.com/office/word/2018/wordml/cex" xmlns:w16cid="http://schemas.microsoft.com/office/word/2016/wordml/cid" xmlns:w16="http://schemas.microsoft.com/office/word/2018/wordml" xmlns:w16du="http://schemas.microsoft.com/office/word/2023/wordml/word16du" xmlns:w16sdtdh="http://schemas.microsoft.com/office/word/2020/wordml/sdtdatahash" xmlns:w16sdtfl="http://schemas.microsoft.com/office/word/2024/wordml/sdtformatlock" xmlns:w16se="http://schemas.microsoft.com/office/word/2015/wordml/symex" xmlns:wpg="http://schemas.microsoft.com/office/word/2010/wordprocessingGroup" xmlns:wpi="http://schemas.microsoft.com/office/word/2010/wordprocessingInk" xmlns:wne="http://schemas.microsoft.com/office/word/2006/wordml" xmlns:wps="http://schemas.microsoft.com/office/word/2010/wordprocessingShape" mc:Ignorable="w14 w15 w16se w16cid w16 w16cex w16sdtdh w16sdtfl w16du wp14">
   <w:endnote w:type="separator" w:id="-1">
     <w:p>
       <w:pPr>
@@ -4281,7 +2281,7 @@
 </file>
 
 <file path=word/footer1.xml><?xml version="1.0" encoding="utf-8"?>
-<w:ftr xmlns:wpc="http://schemas.microsoft.com/office/word/2010/wordprocessingCanvas" xmlns:cx="http://schemas.microsoft.com/office/drawing/2014/chartex" xmlns:cx1="http://schemas.microsoft.com/office/drawing/2015/9/8/chartex" xmlns:cx2="http://schemas.microsoft.com/office/drawing/2015/10/21/chartex" xmlns:cx3="http://schemas.microsoft.com/office/drawing/2016/5/9/chartex" xmlns:cx4="http://schemas.microsoft.com/office/drawing/2016/5/10/chartex" xmlns:cx5="http://schemas.microsoft.com/office/drawing/2016/5/11/chartex" xmlns:cx6="http://schemas.microsoft.com/office/drawing/2016/5/12/chartex" xmlns:cx7="http://schemas.microsoft.com/office/drawing/2016/5/13/chartex" xmlns:cx8="http://schemas.microsoft.com/office/drawing/2016/5/14/chartex" xmlns:mc="http://schemas.openxmlformats.org/markup-compatibility/2006" xmlns:aink="http://schemas.microsoft.com/office/drawing/2016/ink" xmlns:am3d="http://schemas.microsoft.com/office/drawing/2017/model3d" xmlns:o="urn:schemas-microsoft-com:office:office" xmlns:r="http://schemas.openxmlformats.org/officeDocument/2006/relationships" xmlns:m="http://schemas.openxmlformats.org/officeDocument/2006/math" xmlns:v="urn:schemas-microsoft-com:vml" xmlns:wp14="http://schemas.microsoft.com/office/word/2010/wordprocessingDrawing" xmlns:wp="http://schemas.openxmlformats.org/drawingml/2006/wordprocessingDrawing" xmlns:w10="urn:schemas-microsoft-com:office:word" xmlns:w="http://schemas.openxmlformats.org/wordprocessingml/2006/main" xmlns:w14="http://schemas.microsoft.com/office/word/2010/wordml" xmlns:w15="http://schemas.microsoft.com/office/word/2012/wordml" xmlns:w16cex="http://schemas.microsoft.com/office/word/2018/wordml/cex" xmlns:w16cid="http://schemas.microsoft.com/office/word/2016/wordml/cid" xmlns:w16="http://schemas.microsoft.com/office/word/2018/wordml" xmlns:w16sdtdh="http://schemas.microsoft.com/office/word/2020/wordml/sdtdatahash" xmlns:w16se="http://schemas.microsoft.com/office/word/2015/wordml/symex" xmlns:wpg="http://schemas.microsoft.com/office/word/2010/wordprocessingGroup" xmlns:wpi="http://schemas.microsoft.com/office/word/2010/wordprocessingInk" xmlns:wne="http://schemas.microsoft.com/office/word/2006/wordml" xmlns:wps="http://schemas.microsoft.com/office/word/2010/wordprocessingShape" mc:Ignorable="w14 w15 w16se w16cid w16 w16cex w16sdtdh wp14">
+<w:ftr xmlns:wpc="http://schemas.microsoft.com/office/word/2010/wordprocessingCanvas" xmlns:cx="http://schemas.microsoft.com/office/drawing/2014/chartex" xmlns:cx1="http://schemas.microsoft.com/office/drawing/2015/9/8/chartex" xmlns:cx2="http://schemas.microsoft.com/office/drawing/2015/10/21/chartex" xmlns:cx3="http://schemas.microsoft.com/office/drawing/2016/5/9/chartex" xmlns:cx4="http://schemas.microsoft.com/office/drawing/2016/5/10/chartex" xmlns:cx5="http://schemas.microsoft.com/office/drawing/2016/5/11/chartex" xmlns:cx6="http://schemas.microsoft.com/office/drawing/2016/5/12/chartex" xmlns:cx7="http://schemas.microsoft.com/office/drawing/2016/5/13/chartex" xmlns:cx8="http://schemas.microsoft.com/office/drawing/2016/5/14/chartex" xmlns:mc="http://schemas.openxmlformats.org/markup-compatibility/2006" xmlns:aink="http://schemas.microsoft.com/office/drawing/2016/ink" xmlns:am3d="http://schemas.microsoft.com/office/drawing/2017/model3d" xmlns:o="urn:schemas-microsoft-com:office:office" xmlns:oel="http://schemas.microsoft.com/office/2019/extlst" xmlns:r="http://schemas.openxmlformats.org/officeDocument/2006/relationships" xmlns:m="http://schemas.openxmlformats.org/officeDocument/2006/math" xmlns:v="urn:schemas-microsoft-com:vml" xmlns:wp14="http://schemas.microsoft.com/office/word/2010/wordprocessingDrawing" xmlns:wp="http://schemas.openxmlformats.org/drawingml/2006/wordprocessingDrawing" xmlns:w10="urn:schemas-microsoft-com:office:word" xmlns:w="http://schemas.openxmlformats.org/wordprocessingml/2006/main" xmlns:w14="http://schemas.microsoft.com/office/word/2010/wordml" xmlns:w15="http://schemas.microsoft.com/office/word/2012/wordml" xmlns:w16cex="http://schemas.microsoft.com/office/word/2018/wordml/cex" xmlns:w16cid="http://schemas.microsoft.com/office/word/2016/wordml/cid" xmlns:w16="http://schemas.microsoft.com/office/word/2018/wordml" xmlns:w16du="http://schemas.microsoft.com/office/word/2023/wordml/word16du" xmlns:w16sdtdh="http://schemas.microsoft.com/office/word/2020/wordml/sdtdatahash" xmlns:w16sdtfl="http://schemas.microsoft.com/office/word/2024/wordml/sdtformatlock" xmlns:w16se="http://schemas.microsoft.com/office/word/2015/wordml/symex" xmlns:wpg="http://schemas.microsoft.com/office/word/2010/wordprocessingGroup" xmlns:wpi="http://schemas.microsoft.com/office/word/2010/wordprocessingInk" xmlns:wne="http://schemas.microsoft.com/office/word/2006/wordml" xmlns:wps="http://schemas.microsoft.com/office/word/2010/wordprocessingShape" mc:Ignorable="w14 w15 w16se w16cid w16 w16cex w16sdtdh w16sdtfl w16du wp14">
   <w:p>
     <w:pPr>
       <w:pStyle w:val="Piedepgina"/>
@@ -4291,7 +2291,7 @@
 </file>
 
 <file path=word/footer2.xml><?xml version="1.0" encoding="utf-8"?>
-<w:ftr xmlns:wpc="http://schemas.microsoft.com/office/word/2010/wordprocessingCanvas" xmlns:cx="http://schemas.microsoft.com/office/drawing/2014/chartex" xmlns:cx1="http://schemas.microsoft.com/office/drawing/2015/9/8/chartex" xmlns:cx2="http://schemas.microsoft.com/office/drawing/2015/10/21/chartex" xmlns:cx3="http://schemas.microsoft.com/office/drawing/2016/5/9/chartex" xmlns:cx4="http://schemas.microsoft.com/office/drawing/2016/5/10/chartex" xmlns:cx5="http://schemas.microsoft.com/office/drawing/2016/5/11/chartex" xmlns:cx6="http://schemas.microsoft.com/office/drawing/2016/5/12/chartex" xmlns:cx7="http://schemas.microsoft.com/office/drawing/2016/5/13/chartex" xmlns:cx8="http://schemas.microsoft.com/office/drawing/2016/5/14/chartex" xmlns:mc="http://schemas.openxmlformats.org/markup-compatibility/2006" xmlns:aink="http://schemas.microsoft.com/office/drawing/2016/ink" xmlns:am3d="http://schemas.microsoft.com/office/drawing/2017/model3d" xmlns:o="urn:schemas-microsoft-com:office:office" xmlns:r="http://schemas.openxmlformats.org/officeDocument/2006/relationships" xmlns:m="http://schemas.openxmlformats.org/officeDocument/2006/math" xmlns:v="urn:schemas-microsoft-com:vml" xmlns:wp14="http://schemas.microsoft.com/office/word/2010/wordprocessingDrawing" xmlns:wp="http://schemas.openxmlformats.org/drawingml/2006/wordprocessingDrawing" xmlns:w10="urn:schemas-microsoft-com:office:word" xmlns:w="http://schemas.openxmlformats.org/wordprocessingml/2006/main" xmlns:w14="http://schemas.microsoft.com/office/word/2010/wordml" xmlns:w15="http://schemas.microsoft.com/office/word/2012/wordml" xmlns:w16cex="http://schemas.microsoft.com/office/word/2018/wordml/cex" xmlns:w16cid="http://schemas.microsoft.com/office/word/2016/wordml/cid" xmlns:w16="http://schemas.microsoft.com/office/word/2018/wordml" xmlns:w16sdtdh="http://schemas.microsoft.com/office/word/2020/wordml/sdtdatahash" xmlns:w16se="http://schemas.microsoft.com/office/word/2015/wordml/symex" xmlns:wpg="http://schemas.microsoft.com/office/word/2010/wordprocessingGroup" xmlns:wpi="http://schemas.microsoft.com/office/word/2010/wordprocessingInk" xmlns:wne="http://schemas.microsoft.com/office/word/2006/wordml" xmlns:wps="http://schemas.microsoft.com/office/word/2010/wordprocessingShape" mc:Ignorable="w14 w15 w16se w16cid w16 w16cex w16sdtdh wp14">
+<w:ftr xmlns:wpc="http://schemas.microsoft.com/office/word/2010/wordprocessingCanvas" xmlns:cx="http://schemas.microsoft.com/office/drawing/2014/chartex" xmlns:cx1="http://schemas.microsoft.com/office/drawing/2015/9/8/chartex" xmlns:cx2="http://schemas.microsoft.com/office/drawing/2015/10/21/chartex" xmlns:cx3="http://schemas.microsoft.com/office/drawing/2016/5/9/chartex" xmlns:cx4="http://schemas.microsoft.com/office/drawing/2016/5/10/chartex" xmlns:cx5="http://schemas.microsoft.com/office/drawing/2016/5/11/chartex" xmlns:cx6="http://schemas.microsoft.com/office/drawing/2016/5/12/chartex" xmlns:cx7="http://schemas.microsoft.com/office/drawing/2016/5/13/chartex" xmlns:cx8="http://schemas.microsoft.com/office/drawing/2016/5/14/chartex" xmlns:mc="http://schemas.openxmlformats.org/markup-compatibility/2006" xmlns:aink="http://schemas.microsoft.com/office/drawing/2016/ink" xmlns:am3d="http://schemas.microsoft.com/office/drawing/2017/model3d" xmlns:o="urn:schemas-microsoft-com:office:office" xmlns:oel="http://schemas.microsoft.com/office/2019/extlst" xmlns:r="http://schemas.openxmlformats.org/officeDocument/2006/relationships" xmlns:m="http://schemas.openxmlformats.org/officeDocument/2006/math" xmlns:v="urn:schemas-microsoft-com:vml" xmlns:wp14="http://schemas.microsoft.com/office/word/2010/wordprocessingDrawing" xmlns:wp="http://schemas.openxmlformats.org/drawingml/2006/wordprocessingDrawing" xmlns:w10="urn:schemas-microsoft-com:office:word" xmlns:w="http://schemas.openxmlformats.org/wordprocessingml/2006/main" xmlns:w14="http://schemas.microsoft.com/office/word/2010/wordml" xmlns:w15="http://schemas.microsoft.com/office/word/2012/wordml" xmlns:w16cex="http://schemas.microsoft.com/office/word/2018/wordml/cex" xmlns:w16cid="http://schemas.microsoft.com/office/word/2016/wordml/cid" xmlns:w16="http://schemas.microsoft.com/office/word/2018/wordml" xmlns:w16du="http://schemas.microsoft.com/office/word/2023/wordml/word16du" xmlns:w16sdtdh="http://schemas.microsoft.com/office/word/2020/wordml/sdtdatahash" xmlns:w16sdtfl="http://schemas.microsoft.com/office/word/2024/wordml/sdtformatlock" xmlns:w16se="http://schemas.microsoft.com/office/word/2015/wordml/symex" xmlns:wpg="http://schemas.microsoft.com/office/word/2010/wordprocessingGroup" xmlns:wpi="http://schemas.microsoft.com/office/word/2010/wordprocessingInk" xmlns:wne="http://schemas.microsoft.com/office/word/2006/wordml" xmlns:wps="http://schemas.microsoft.com/office/word/2010/wordprocessingShape" mc:Ignorable="w14 w15 w16se w16cid w16 w16cex w16sdtdh w16sdtfl w16du wp14">
   <w:sdt>
     <w:sdtPr>
       <w:id w:val="-1904276369"/>
@@ -4300,7 +2300,6 @@
         <w:docPartUnique/>
       </w:docPartObj>
     </w:sdtPr>
-    <w:sdtEndPr/>
     <w:sdtContent>
       <w:p>
         <w:pPr>
@@ -4510,14 +2509,14 @@
                 </wp:anchor>
               </w:drawing>
             </mc:Choice>
-            <mc:Fallback>
+            <mc:Fallback xmlns:a14="http://schemas.microsoft.com/office/drawing/2010/main" xmlns:a="http://schemas.openxmlformats.org/drawingml/2006/main">
               <w:pict>
-                <v:group w14:anchorId="51D00065" id="Grupo 32" o:spid="_x0000_s1026" style="position:absolute;margin-left:0;margin-top:0;width:610.5pt;height:15pt;z-index:251659264;mso-width-percent:1000;mso-position-horizontal:center;mso-position-horizontal-relative:page;mso-position-vertical:center;mso-position-vertical-relative:bottom-margin-area;mso-width-percent:1000" coordorigin=",14970" coordsize="12255,300" o:gfxdata="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">
+                <v:group id="Grupo 32" style="position:absolute;margin-left:0;margin-top:0;width:610.5pt;height:15pt;z-index:251659264;mso-width-percent:1000;mso-position-horizontal:center;mso-position-horizontal-relative:page;mso-position-vertical:center;mso-position-vertical-relative:bottom-margin-area;mso-width-percent:1000" coordsize="12255,300" coordorigin=",14970" o:spid="_x0000_s1026" w14:anchorId="51D00065" o:gfxdata="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">
                   <v:shapetype id="_x0000_t202" coordsize="21600,21600" o:spt="202" path="m,l,21600r21600,l21600,xe">
                     <v:stroke joinstyle="miter"/>
                     <v:path gradientshapeok="t" o:connecttype="rect"/>
                   </v:shapetype>
-                  <v:shape id="Text Box 25" o:spid="_x0000_s1027" type="#_x0000_t202" style="position:absolute;left:10803;top:14982;width:659;height:288;visibility:visible;mso-wrap-style:square;v-text-anchor:top" o:gfxdata="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" filled="f" stroked="f">
+                  <v:shape id="Text Box 25" style="position:absolute;left:10803;top:14982;width:659;height:288;visibility:visible;mso-wrap-style:square;v-text-anchor:top" o:spid="_x0000_s1027" filled="f" stroked="f" type="#_x0000_t202" o:gfxdata="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">
                     <v:textbox inset="0,0,0,0">
                       <w:txbxContent>
                         <w:p>
@@ -4551,20 +2550,20 @@
                       </w:txbxContent>
                     </v:textbox>
                   </v:shape>
-                  <v:group id="Group 31" o:spid="_x0000_s1028" style="position:absolute;top:14970;width:12255;height:230;flip:x" coordorigin="-8,14978" coordsize="12255,230" o:gfxdata="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">
-                    <v:shapetype id="_x0000_t34" coordsize="21600,21600" o:spt="34" o:oned="t" adj="10800" path="m,l@0,0@0,21600,21600,21600e" filled="f">
+                  <v:group id="Group 31" style="position:absolute;top:14970;width:12255;height:230;flip:x" coordsize="12255,230" coordorigin="-8,14978" o:spid="_x0000_s1028" o:gfxdata="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">
+                    <v:shapetype id="_x0000_t34" coordsize="21600,21600" o:oned="t" filled="f" o:spt="34" adj="10800" path="m,l@0,0@0,21600,21600,21600e">
                       <v:stroke joinstyle="miter"/>
                       <v:formulas>
                         <v:f eqn="val #0"/>
                       </v:formulas>
-                      <v:path arrowok="t" fillok="f" o:connecttype="none"/>
+                      <v:path fillok="f" arrowok="t" o:connecttype="none"/>
                       <v:handles>
                         <v:h position="#0,center"/>
                       </v:handles>
                       <o:lock v:ext="edit" shapetype="t"/>
                     </v:shapetype>
-                    <v:shape id="AutoShape 27" o:spid="_x0000_s1029" type="#_x0000_t34" style="position:absolute;left:-8;top:14978;width:1260;height:230;flip:y;visibility:visible;mso-wrap-style:square" o:connectortype="elbow" o:gfxdata="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" strokecolor="#a5a5a5"/>
-                    <v:shape id="AutoShape 28" o:spid="_x0000_s1030" type="#_x0000_t34" style="position:absolute;left:1252;top:14978;width:10995;height:230;rotation:180;visibility:visible;mso-wrap-style:square" o:connectortype="elbow" o:gfxdata="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" adj="20904" strokecolor="#a5a5a5"/>
+                    <v:shape id="AutoShape 27" style="position:absolute;left:-8;top:14978;width:1260;height:230;flip:y;visibility:visible;mso-wrap-style:square" o:spid="_x0000_s1029" strokecolor="#a5a5a5" o:connectortype="elbow" type="#_x0000_t34" o:gfxdata="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"/>
+                    <v:shape id="AutoShape 28" style="position:absolute;left:1252;top:14978;width:10995;height:230;rotation:180;visibility:visible;mso-wrap-style:square" o:spid="_x0000_s1030" strokecolor="#a5a5a5" o:connectortype="elbow" type="#_x0000_t34" adj="20904" o:gfxdata="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"/>
                   </v:group>
                   <w10:wrap anchorx="page" anchory="margin"/>
                 </v:group>
@@ -4579,7 +2578,7 @@
 </file>
 
 <file path=word/footer3.xml><?xml version="1.0" encoding="utf-8"?>
-<w:ftr xmlns:wpc="http://schemas.microsoft.com/office/word/2010/wordprocessingCanvas" xmlns:cx="http://schemas.microsoft.com/office/drawing/2014/chartex" xmlns:cx1="http://schemas.microsoft.com/office/drawing/2015/9/8/chartex" xmlns:cx2="http://schemas.microsoft.com/office/drawing/2015/10/21/chartex" xmlns:cx3="http://schemas.microsoft.com/office/drawing/2016/5/9/chartex" xmlns:cx4="http://schemas.microsoft.com/office/drawing/2016/5/10/chartex" xmlns:cx5="http://schemas.microsoft.com/office/drawing/2016/5/11/chartex" xmlns:cx6="http://schemas.microsoft.com/office/drawing/2016/5/12/chartex" xmlns:cx7="http://schemas.microsoft.com/office/drawing/2016/5/13/chartex" xmlns:cx8="http://schemas.microsoft.com/office/drawing/2016/5/14/chartex" xmlns:mc="http://schemas.openxmlformats.org/markup-compatibility/2006" xmlns:aink="http://schemas.microsoft.com/office/drawing/2016/ink" xmlns:am3d="http://schemas.microsoft.com/office/drawing/2017/model3d" xmlns:o="urn:schemas-microsoft-com:office:office" xmlns:r="http://schemas.openxmlformats.org/officeDocument/2006/relationships" xmlns:m="http://schemas.openxmlformats.org/officeDocument/2006/math" xmlns:v="urn:schemas-microsoft-com:vml" xmlns:wp14="http://schemas.microsoft.com/office/word/2010/wordprocessingDrawing" xmlns:wp="http://schemas.openxmlformats.org/drawingml/2006/wordprocessingDrawing" xmlns:w10="urn:schemas-microsoft-com:office:word" xmlns:w="http://schemas.openxmlformats.org/wordprocessingml/2006/main" xmlns:w14="http://schemas.microsoft.com/office/word/2010/wordml" xmlns:w15="http://schemas.microsoft.com/office/word/2012/wordml" xmlns:w16cex="http://schemas.microsoft.com/office/word/2018/wordml/cex" xmlns:w16cid="http://schemas.microsoft.com/office/word/2016/wordml/cid" xmlns:w16="http://schemas.microsoft.com/office/word/2018/wordml" xmlns:w16sdtdh="http://schemas.microsoft.com/office/word/2020/wordml/sdtdatahash" xmlns:w16se="http://schemas.microsoft.com/office/word/2015/wordml/symex" xmlns:wpg="http://schemas.microsoft.com/office/word/2010/wordprocessingGroup" xmlns:wpi="http://schemas.microsoft.com/office/word/2010/wordprocessingInk" xmlns:wne="http://schemas.microsoft.com/office/word/2006/wordml" xmlns:wps="http://schemas.microsoft.com/office/word/2010/wordprocessingShape" mc:Ignorable="w14 w15 w16se w16cid w16 w16cex w16sdtdh wp14">
+<w:ftr xmlns:wpc="http://schemas.microsoft.com/office/word/2010/wordprocessingCanvas" xmlns:cx="http://schemas.microsoft.com/office/drawing/2014/chartex" xmlns:cx1="http://schemas.microsoft.com/office/drawing/2015/9/8/chartex" xmlns:cx2="http://schemas.microsoft.com/office/drawing/2015/10/21/chartex" xmlns:cx3="http://schemas.microsoft.com/office/drawing/2016/5/9/chartex" xmlns:cx4="http://schemas.microsoft.com/office/drawing/2016/5/10/chartex" xmlns:cx5="http://schemas.microsoft.com/office/drawing/2016/5/11/chartex" xmlns:cx6="http://schemas.microsoft.com/office/drawing/2016/5/12/chartex" xmlns:cx7="http://schemas.microsoft.com/office/drawing/2016/5/13/chartex" xmlns:cx8="http://schemas.microsoft.com/office/drawing/2016/5/14/chartex" xmlns:mc="http://schemas.openxmlformats.org/markup-compatibility/2006" xmlns:aink="http://schemas.microsoft.com/office/drawing/2016/ink" xmlns:am3d="http://schemas.microsoft.com/office/drawing/2017/model3d" xmlns:o="urn:schemas-microsoft-com:office:office" xmlns:oel="http://schemas.microsoft.com/office/2019/extlst" xmlns:r="http://schemas.openxmlformats.org/officeDocument/2006/relationships" xmlns:m="http://schemas.openxmlformats.org/officeDocument/2006/math" xmlns:v="urn:schemas-microsoft-com:vml" xmlns:wp14="http://schemas.microsoft.com/office/word/2010/wordprocessingDrawing" xmlns:wp="http://schemas.openxmlformats.org/drawingml/2006/wordprocessingDrawing" xmlns:w10="urn:schemas-microsoft-com:office:word" xmlns:w="http://schemas.openxmlformats.org/wordprocessingml/2006/main" xmlns:w14="http://schemas.microsoft.com/office/word/2010/wordml" xmlns:w15="http://schemas.microsoft.com/office/word/2012/wordml" xmlns:w16cex="http://schemas.microsoft.com/office/word/2018/wordml/cex" xmlns:w16cid="http://schemas.microsoft.com/office/word/2016/wordml/cid" xmlns:w16="http://schemas.microsoft.com/office/word/2018/wordml" xmlns:w16du="http://schemas.microsoft.com/office/word/2023/wordml/word16du" xmlns:w16sdtdh="http://schemas.microsoft.com/office/word/2020/wordml/sdtdatahash" xmlns:w16sdtfl="http://schemas.microsoft.com/office/word/2024/wordml/sdtformatlock" xmlns:w16se="http://schemas.microsoft.com/office/word/2015/wordml/symex" xmlns:wpg="http://schemas.microsoft.com/office/word/2010/wordprocessingGroup" xmlns:wpi="http://schemas.microsoft.com/office/word/2010/wordprocessingInk" xmlns:wne="http://schemas.microsoft.com/office/word/2006/wordml" xmlns:wps="http://schemas.microsoft.com/office/word/2010/wordprocessingShape" mc:Ignorable="w14 w15 w16se w16cid w16 w16cex w16sdtdh w16sdtfl w16du wp14">
   <w:p>
     <w:pPr>
       <w:pStyle w:val="Piedepgina"/>
@@ -4589,7 +2588,7 @@
 </file>
 
 <file path=word/footnotes.xml><?xml version="1.0" encoding="utf-8"?>
-<w:footnotes xmlns:wpc="http://schemas.microsoft.com/office/word/2010/wordprocessingCanvas" xmlns:cx="http://schemas.microsoft.com/office/drawing/2014/chartex" xmlns:cx1="http://schemas.microsoft.com/office/drawing/2015/9/8/chartex" xmlns:cx2="http://schemas.microsoft.com/office/drawing/2015/10/21/chartex" xmlns:cx3="http://schemas.microsoft.com/office/drawing/2016/5/9/chartex" xmlns:cx4="http://schemas.microsoft.com/office/drawing/2016/5/10/chartex" xmlns:cx5="http://schemas.microsoft.com/office/drawing/2016/5/11/chartex" xmlns:cx6="http://schemas.microsoft.com/office/drawing/2016/5/12/chartex" xmlns:cx7="http://schemas.microsoft.com/office/drawing/2016/5/13/chartex" xmlns:cx8="http://schemas.microsoft.com/office/drawing/2016/5/14/chartex" xmlns:mc="http://schemas.openxmlformats.org/markup-compatibility/2006" xmlns:aink="http://schemas.microsoft.com/office/drawing/2016/ink" xmlns:am3d="http://schemas.microsoft.com/office/drawing/2017/model3d" xmlns:o="urn:schemas-microsoft-com:office:office" xmlns:r="http://schemas.openxmlformats.org/officeDocument/2006/relationships" xmlns:m="http://schemas.openxmlformats.org/officeDocument/2006/math" xmlns:v="urn:schemas-microsoft-com:vml" xmlns:wp14="http://schemas.microsoft.com/office/word/2010/wordprocessingDrawing" xmlns:wp="http://schemas.openxmlformats.org/drawingml/2006/wordprocessingDrawing" xmlns:w10="urn:schemas-microsoft-com:office:word" xmlns:w="http://schemas.openxmlformats.org/wordprocessingml/2006/main" xmlns:w14="http://schemas.microsoft.com/office/word/2010/wordml" xmlns:w15="http://schemas.microsoft.com/office/word/2012/wordml" xmlns:w16cex="http://schemas.microsoft.com/office/word/2018/wordml/cex" xmlns:w16cid="http://schemas.microsoft.com/office/word/2016/wordml/cid" xmlns:w16="http://schemas.microsoft.com/office/word/2018/wordml" xmlns:w16sdtdh="http://schemas.microsoft.com/office/word/2020/wordml/sdtdatahash" xmlns:w16se="http://schemas.microsoft.com/office/word/2015/wordml/symex" xmlns:wpg="http://schemas.microsoft.com/office/word/2010/wordprocessingGroup" xmlns:wpi="http://schemas.microsoft.com/office/word/2010/wordprocessingInk" xmlns:wne="http://schemas.microsoft.com/office/word/2006/wordml" xmlns:wps="http://schemas.microsoft.com/office/word/2010/wordprocessingShape" mc:Ignorable="w14 w15 w16se w16cid w16 w16cex w16sdtdh wp14">
+<w:footnotes xmlns:wpc="http://schemas.microsoft.com/office/word/2010/wordprocessingCanvas" xmlns:cx="http://schemas.microsoft.com/office/drawing/2014/chartex" xmlns:cx1="http://schemas.microsoft.com/office/drawing/2015/9/8/chartex" xmlns:cx2="http://schemas.microsoft.com/office/drawing/2015/10/21/chartex" xmlns:cx3="http://schemas.microsoft.com/office/drawing/2016/5/9/chartex" xmlns:cx4="http://schemas.microsoft.com/office/drawing/2016/5/10/chartex" xmlns:cx5="http://schemas.microsoft.com/office/drawing/2016/5/11/chartex" xmlns:cx6="http://schemas.microsoft.com/office/drawing/2016/5/12/chartex" xmlns:cx7="http://schemas.microsoft.com/office/drawing/2016/5/13/chartex" xmlns:cx8="http://schemas.microsoft.com/office/drawing/2016/5/14/chartex" xmlns:mc="http://schemas.openxmlformats.org/markup-compatibility/2006" xmlns:aink="http://schemas.microsoft.com/office/drawing/2016/ink" xmlns:am3d="http://schemas.microsoft.com/office/drawing/2017/model3d" xmlns:o="urn:schemas-microsoft-com:office:office" xmlns:oel="http://schemas.microsoft.com/office/2019/extlst" xmlns:r="http://schemas.openxmlformats.org/officeDocument/2006/relationships" xmlns:m="http://schemas.openxmlformats.org/officeDocument/2006/math" xmlns:v="urn:schemas-microsoft-com:vml" xmlns:wp14="http://schemas.microsoft.com/office/word/2010/wordprocessingDrawing" xmlns:wp="http://schemas.openxmlformats.org/drawingml/2006/wordprocessingDrawing" xmlns:w10="urn:schemas-microsoft-com:office:word" xmlns:w="http://schemas.openxmlformats.org/wordprocessingml/2006/main" xmlns:w14="http://schemas.microsoft.com/office/word/2010/wordml" xmlns:w15="http://schemas.microsoft.com/office/word/2012/wordml" xmlns:w16cex="http://schemas.microsoft.com/office/word/2018/wordml/cex" xmlns:w16cid="http://schemas.microsoft.com/office/word/2016/wordml/cid" xmlns:w16="http://schemas.microsoft.com/office/word/2018/wordml" xmlns:w16du="http://schemas.microsoft.com/office/word/2023/wordml/word16du" xmlns:w16sdtdh="http://schemas.microsoft.com/office/word/2020/wordml/sdtdatahash" xmlns:w16sdtfl="http://schemas.microsoft.com/office/word/2024/wordml/sdtformatlock" xmlns:w16se="http://schemas.microsoft.com/office/word/2015/wordml/symex" xmlns:wpg="http://schemas.microsoft.com/office/word/2010/wordprocessingGroup" xmlns:wpi="http://schemas.microsoft.com/office/word/2010/wordprocessingInk" xmlns:wne="http://schemas.microsoft.com/office/word/2006/wordml" xmlns:wps="http://schemas.microsoft.com/office/word/2010/wordprocessingShape" mc:Ignorable="w14 w15 w16se w16cid w16 w16cex w16sdtdh w16sdtfl w16du wp14">
   <w:footnote w:type="separator" w:id="-1">
     <w:p>
       <w:pPr>
@@ -4614,7 +2613,7 @@
 </file>
 
 <file path=word/header1.xml><?xml version="1.0" encoding="utf-8"?>
-<w:hdr xmlns:wpc="http://schemas.microsoft.com/office/word/2010/wordprocessingCanvas" xmlns:cx="http://schemas.microsoft.com/office/drawing/2014/chartex" xmlns:cx1="http://schemas.microsoft.com/office/drawing/2015/9/8/chartex" xmlns:cx2="http://schemas.microsoft.com/office/drawing/2015/10/21/chartex" xmlns:cx3="http://schemas.microsoft.com/office/drawing/2016/5/9/chartex" xmlns:cx4="http://schemas.microsoft.com/office/drawing/2016/5/10/chartex" xmlns:cx5="http://schemas.microsoft.com/office/drawing/2016/5/11/chartex" xmlns:cx6="http://schemas.microsoft.com/office/drawing/2016/5/12/chartex" xmlns:cx7="http://schemas.microsoft.com/office/drawing/2016/5/13/chartex" xmlns:cx8="http://schemas.microsoft.com/office/drawing/2016/5/14/chartex" xmlns:mc="http://schemas.openxmlformats.org/markup-compatibility/2006" xmlns:aink="http://schemas.microsoft.com/office/drawing/2016/ink" xmlns:am3d="http://schemas.microsoft.com/office/drawing/2017/model3d" xmlns:o="urn:schemas-microsoft-com:office:office" xmlns:r="http://schemas.openxmlformats.org/officeDocument/2006/relationships" xmlns:m="http://schemas.openxmlformats.org/officeDocument/2006/math" xmlns:v="urn:schemas-microsoft-com:vml" xmlns:wp14="http://schemas.microsoft.com/office/word/2010/wordprocessingDrawing" xmlns:wp="http://schemas.openxmlformats.org/drawingml/2006/wordprocessingDrawing" xmlns:w10="urn:schemas-microsoft-com:office:word" xmlns:w="http://schemas.openxmlformats.org/wordprocessingml/2006/main" xmlns:w14="http://schemas.microsoft.com/office/word/2010/wordml" xmlns:w15="http://schemas.microsoft.com/office/word/2012/wordml" xmlns:w16cex="http://schemas.microsoft.com/office/word/2018/wordml/cex" xmlns:w16cid="http://schemas.microsoft.com/office/word/2016/wordml/cid" xmlns:w16="http://schemas.microsoft.com/office/word/2018/wordml" xmlns:w16sdtdh="http://schemas.microsoft.com/office/word/2020/wordml/sdtdatahash" xmlns:w16se="http://schemas.microsoft.com/office/word/2015/wordml/symex" xmlns:wpg="http://schemas.microsoft.com/office/word/2010/wordprocessingGroup" xmlns:wpi="http://schemas.microsoft.com/office/word/2010/wordprocessingInk" xmlns:wne="http://schemas.microsoft.com/office/word/2006/wordml" xmlns:wps="http://schemas.microsoft.com/office/word/2010/wordprocessingShape" mc:Ignorable="w14 w15 w16se w16cid w16 w16cex w16sdtdh wp14">
+<w:hdr xmlns:wpc="http://schemas.microsoft.com/office/word/2010/wordprocessingCanvas" xmlns:cx="http://schemas.microsoft.com/office/drawing/2014/chartex" xmlns:cx1="http://schemas.microsoft.com/office/drawing/2015/9/8/chartex" xmlns:cx2="http://schemas.microsoft.com/office/drawing/2015/10/21/chartex" xmlns:cx3="http://schemas.microsoft.com/office/drawing/2016/5/9/chartex" xmlns:cx4="http://schemas.microsoft.com/office/drawing/2016/5/10/chartex" xmlns:cx5="http://schemas.microsoft.com/office/drawing/2016/5/11/chartex" xmlns:cx6="http://schemas.microsoft.com/office/drawing/2016/5/12/chartex" xmlns:cx7="http://schemas.microsoft.com/office/drawing/2016/5/13/chartex" xmlns:cx8="http://schemas.microsoft.com/office/drawing/2016/5/14/chartex" xmlns:mc="http://schemas.openxmlformats.org/markup-compatibility/2006" xmlns:aink="http://schemas.microsoft.com/office/drawing/2016/ink" xmlns:am3d="http://schemas.microsoft.com/office/drawing/2017/model3d" xmlns:o="urn:schemas-microsoft-com:office:office" xmlns:oel="http://schemas.microsoft.com/office/2019/extlst" xmlns:r="http://schemas.openxmlformats.org/officeDocument/2006/relationships" xmlns:m="http://schemas.openxmlformats.org/officeDocument/2006/math" xmlns:v="urn:schemas-microsoft-com:vml" xmlns:wp14="http://schemas.microsoft.com/office/word/2010/wordprocessingDrawing" xmlns:wp="http://schemas.openxmlformats.org/drawingml/2006/wordprocessingDrawing" xmlns:w10="urn:schemas-microsoft-com:office:word" xmlns:w="http://schemas.openxmlformats.org/wordprocessingml/2006/main" xmlns:w14="http://schemas.microsoft.com/office/word/2010/wordml" xmlns:w15="http://schemas.microsoft.com/office/word/2012/wordml" xmlns:w16cex="http://schemas.microsoft.com/office/word/2018/wordml/cex" xmlns:w16cid="http://schemas.microsoft.com/office/word/2016/wordml/cid" xmlns:w16="http://schemas.microsoft.com/office/word/2018/wordml" xmlns:w16du="http://schemas.microsoft.com/office/word/2023/wordml/word16du" xmlns:w16sdtdh="http://schemas.microsoft.com/office/word/2020/wordml/sdtdatahash" xmlns:w16sdtfl="http://schemas.microsoft.com/office/word/2024/wordml/sdtformatlock" xmlns:w16se="http://schemas.microsoft.com/office/word/2015/wordml/symex" xmlns:wpg="http://schemas.microsoft.com/office/word/2010/wordprocessingGroup" xmlns:wpi="http://schemas.microsoft.com/office/word/2010/wordprocessingInk" xmlns:wne="http://schemas.microsoft.com/office/word/2006/wordml" xmlns:wps="http://schemas.microsoft.com/office/word/2010/wordprocessingShape" mc:Ignorable="w14 w15 w16se w16cid w16 w16cex w16sdtdh w16sdtfl w16du wp14">
   <w:p>
     <w:pPr>
       <w:pStyle w:val="Encabezado"/>
@@ -4624,7 +2623,7 @@
 </file>
 
 <file path=word/header2.xml><?xml version="1.0" encoding="utf-8"?>
-<w:hdr xmlns:wpc="http://schemas.microsoft.com/office/word/2010/wordprocessingCanvas" xmlns:cx="http://schemas.microsoft.com/office/drawing/2014/chartex" xmlns:cx1="http://schemas.microsoft.com/office/drawing/2015/9/8/chartex" xmlns:cx2="http://schemas.microsoft.com/office/drawing/2015/10/21/chartex" xmlns:cx3="http://schemas.microsoft.com/office/drawing/2016/5/9/chartex" xmlns:cx4="http://schemas.microsoft.com/office/drawing/2016/5/10/chartex" xmlns:cx5="http://schemas.microsoft.com/office/drawing/2016/5/11/chartex" xmlns:cx6="http://schemas.microsoft.com/office/drawing/2016/5/12/chartex" xmlns:cx7="http://schemas.microsoft.com/office/drawing/2016/5/13/chartex" xmlns:cx8="http://schemas.microsoft.com/office/drawing/2016/5/14/chartex" xmlns:mc="http://schemas.openxmlformats.org/markup-compatibility/2006" xmlns:aink="http://schemas.microsoft.com/office/drawing/2016/ink" xmlns:am3d="http://schemas.microsoft.com/office/drawing/2017/model3d" xmlns:o="urn:schemas-microsoft-com:office:office" xmlns:r="http://schemas.openxmlformats.org/officeDocument/2006/relationships" xmlns:m="http://schemas.openxmlformats.org/officeDocument/2006/math" xmlns:v="urn:schemas-microsoft-com:vml" xmlns:wp14="http://schemas.microsoft.com/office/word/2010/wordprocessingDrawing" xmlns:wp="http://schemas.openxmlformats.org/drawingml/2006/wordprocessingDrawing" xmlns:w10="urn:schemas-microsoft-com:office:word" xmlns:w="http://schemas.openxmlformats.org/wordprocessingml/2006/main" xmlns:w14="http://schemas.microsoft.com/office/word/2010/wordml" xmlns:w15="http://schemas.microsoft.com/office/word/2012/wordml" xmlns:w16cex="http://schemas.microsoft.com/office/word/2018/wordml/cex" xmlns:w16cid="http://schemas.microsoft.com/office/word/2016/wordml/cid" xmlns:w16="http://schemas.microsoft.com/office/word/2018/wordml" xmlns:w16sdtdh="http://schemas.microsoft.com/office/word/2020/wordml/sdtdatahash" xmlns:w16se="http://schemas.microsoft.com/office/word/2015/wordml/symex" xmlns:wpg="http://schemas.microsoft.com/office/word/2010/wordprocessingGroup" xmlns:wpi="http://schemas.microsoft.com/office/word/2010/wordprocessingInk" xmlns:wne="http://schemas.microsoft.com/office/word/2006/wordml" xmlns:wps="http://schemas.microsoft.com/office/word/2010/wordprocessingShape" mc:Ignorable="w14 w15 w16se w16cid w16 w16cex w16sdtdh wp14">
+<w:hdr xmlns:wpc="http://schemas.microsoft.com/office/word/2010/wordprocessingCanvas" xmlns:cx="http://schemas.microsoft.com/office/drawing/2014/chartex" xmlns:cx1="http://schemas.microsoft.com/office/drawing/2015/9/8/chartex" xmlns:cx2="http://schemas.microsoft.com/office/drawing/2015/10/21/chartex" xmlns:cx3="http://schemas.microsoft.com/office/drawing/2016/5/9/chartex" xmlns:cx4="http://schemas.microsoft.com/office/drawing/2016/5/10/chartex" xmlns:cx5="http://schemas.microsoft.com/office/drawing/2016/5/11/chartex" xmlns:cx6="http://schemas.microsoft.com/office/drawing/2016/5/12/chartex" xmlns:cx7="http://schemas.microsoft.com/office/drawing/2016/5/13/chartex" xmlns:cx8="http://schemas.microsoft.com/office/drawing/2016/5/14/chartex" xmlns:mc="http://schemas.openxmlformats.org/markup-compatibility/2006" xmlns:aink="http://schemas.microsoft.com/office/drawing/2016/ink" xmlns:am3d="http://schemas.microsoft.com/office/drawing/2017/model3d" xmlns:o="urn:schemas-microsoft-com:office:office" xmlns:oel="http://schemas.microsoft.com/office/2019/extlst" xmlns:r="http://schemas.openxmlformats.org/officeDocument/2006/relationships" xmlns:m="http://schemas.openxmlformats.org/officeDocument/2006/math" xmlns:v="urn:schemas-microsoft-com:vml" xmlns:wp14="http://schemas.microsoft.com/office/word/2010/wordprocessingDrawing" xmlns:wp="http://schemas.openxmlformats.org/drawingml/2006/wordprocessingDrawing" xmlns:w10="urn:schemas-microsoft-com:office:word" xmlns:w="http://schemas.openxmlformats.org/wordprocessingml/2006/main" xmlns:w14="http://schemas.microsoft.com/office/word/2010/wordml" xmlns:w15="http://schemas.microsoft.com/office/word/2012/wordml" xmlns:w16cex="http://schemas.microsoft.com/office/word/2018/wordml/cex" xmlns:w16cid="http://schemas.microsoft.com/office/word/2016/wordml/cid" xmlns:w16="http://schemas.microsoft.com/office/word/2018/wordml" xmlns:w16du="http://schemas.microsoft.com/office/word/2023/wordml/word16du" xmlns:w16sdtdh="http://schemas.microsoft.com/office/word/2020/wordml/sdtdatahash" xmlns:w16sdtfl="http://schemas.microsoft.com/office/word/2024/wordml/sdtformatlock" xmlns:w16se="http://schemas.microsoft.com/office/word/2015/wordml/symex" xmlns:wpg="http://schemas.microsoft.com/office/word/2010/wordprocessingGroup" xmlns:wpi="http://schemas.microsoft.com/office/word/2010/wordprocessingInk" xmlns:wne="http://schemas.microsoft.com/office/word/2006/wordml" xmlns:wps="http://schemas.microsoft.com/office/word/2010/wordprocessingShape" mc:Ignorable="w14 w15 w16se w16cid w16 w16cex w16sdtdh w16sdtfl w16du wp14">
   <w:tbl>
     <w:tblPr>
       <w:tblStyle w:val="Tablaconcuadrcula"/>
@@ -4785,7 +2784,7 @@
 </file>
 
 <file path=word/header3.xml><?xml version="1.0" encoding="utf-8"?>
-<w:hdr xmlns:wpc="http://schemas.microsoft.com/office/word/2010/wordprocessingCanvas" xmlns:cx="http://schemas.microsoft.com/office/drawing/2014/chartex" xmlns:cx1="http://schemas.microsoft.com/office/drawing/2015/9/8/chartex" xmlns:cx2="http://schemas.microsoft.com/office/drawing/2015/10/21/chartex" xmlns:cx3="http://schemas.microsoft.com/office/drawing/2016/5/9/chartex" xmlns:cx4="http://schemas.microsoft.com/office/drawing/2016/5/10/chartex" xmlns:cx5="http://schemas.microsoft.com/office/drawing/2016/5/11/chartex" xmlns:cx6="http://schemas.microsoft.com/office/drawing/2016/5/12/chartex" xmlns:cx7="http://schemas.microsoft.com/office/drawing/2016/5/13/chartex" xmlns:cx8="http://schemas.microsoft.com/office/drawing/2016/5/14/chartex" xmlns:mc="http://schemas.openxmlformats.org/markup-compatibility/2006" xmlns:aink="http://schemas.microsoft.com/office/drawing/2016/ink" xmlns:am3d="http://schemas.microsoft.com/office/drawing/2017/model3d" xmlns:o="urn:schemas-microsoft-com:office:office" xmlns:r="http://schemas.openxmlformats.org/officeDocument/2006/relationships" xmlns:m="http://schemas.openxmlformats.org/officeDocument/2006/math" xmlns:v="urn:schemas-microsoft-com:vml" xmlns:wp14="http://schemas.microsoft.com/office/word/2010/wordprocessingDrawing" xmlns:wp="http://schemas.openxmlformats.org/drawingml/2006/wordprocessingDrawing" xmlns:w10="urn:schemas-microsoft-com:office:word" xmlns:w="http://schemas.openxmlformats.org/wordprocessingml/2006/main" xmlns:w14="http://schemas.microsoft.com/office/word/2010/wordml" xmlns:w15="http://schemas.microsoft.com/office/word/2012/wordml" xmlns:w16cex="http://schemas.microsoft.com/office/word/2018/wordml/cex" xmlns:w16cid="http://schemas.microsoft.com/office/word/2016/wordml/cid" xmlns:w16="http://schemas.microsoft.com/office/word/2018/wordml" xmlns:w16sdtdh="http://schemas.microsoft.com/office/word/2020/wordml/sdtdatahash" xmlns:w16se="http://schemas.microsoft.com/office/word/2015/wordml/symex" xmlns:wpg="http://schemas.microsoft.com/office/word/2010/wordprocessingGroup" xmlns:wpi="http://schemas.microsoft.com/office/word/2010/wordprocessingInk" xmlns:wne="http://schemas.microsoft.com/office/word/2006/wordml" xmlns:wps="http://schemas.microsoft.com/office/word/2010/wordprocessingShape" mc:Ignorable="w14 w15 w16se w16cid w16 w16cex w16sdtdh wp14">
+<w:hdr xmlns:wpc="http://schemas.microsoft.com/office/word/2010/wordprocessingCanvas" xmlns:cx="http://schemas.microsoft.com/office/drawing/2014/chartex" xmlns:cx1="http://schemas.microsoft.com/office/drawing/2015/9/8/chartex" xmlns:cx2="http://schemas.microsoft.com/office/drawing/2015/10/21/chartex" xmlns:cx3="http://schemas.microsoft.com/office/drawing/2016/5/9/chartex" xmlns:cx4="http://schemas.microsoft.com/office/drawing/2016/5/10/chartex" xmlns:cx5="http://schemas.microsoft.com/office/drawing/2016/5/11/chartex" xmlns:cx6="http://schemas.microsoft.com/office/drawing/2016/5/12/chartex" xmlns:cx7="http://schemas.microsoft.com/office/drawing/2016/5/13/chartex" xmlns:cx8="http://schemas.microsoft.com/office/drawing/2016/5/14/chartex" xmlns:mc="http://schemas.openxmlformats.org/markup-compatibility/2006" xmlns:aink="http://schemas.microsoft.com/office/drawing/2016/ink" xmlns:am3d="http://schemas.microsoft.com/office/drawing/2017/model3d" xmlns:o="urn:schemas-microsoft-com:office:office" xmlns:oel="http://schemas.microsoft.com/office/2019/extlst" xmlns:r="http://schemas.openxmlformats.org/officeDocument/2006/relationships" xmlns:m="http://schemas.openxmlformats.org/officeDocument/2006/math" xmlns:v="urn:schemas-microsoft-com:vml" xmlns:wp14="http://schemas.microsoft.com/office/word/2010/wordprocessingDrawing" xmlns:wp="http://schemas.openxmlformats.org/drawingml/2006/wordprocessingDrawing" xmlns:w10="urn:schemas-microsoft-com:office:word" xmlns:w="http://schemas.openxmlformats.org/wordprocessingml/2006/main" xmlns:w14="http://schemas.microsoft.com/office/word/2010/wordml" xmlns:w15="http://schemas.microsoft.com/office/word/2012/wordml" xmlns:w16cex="http://schemas.microsoft.com/office/word/2018/wordml/cex" xmlns:w16cid="http://schemas.microsoft.com/office/word/2016/wordml/cid" xmlns:w16="http://schemas.microsoft.com/office/word/2018/wordml" xmlns:w16du="http://schemas.microsoft.com/office/word/2023/wordml/word16du" xmlns:w16sdtdh="http://schemas.microsoft.com/office/word/2020/wordml/sdtdatahash" xmlns:w16sdtfl="http://schemas.microsoft.com/office/word/2024/wordml/sdtformatlock" xmlns:w16se="http://schemas.microsoft.com/office/word/2015/wordml/symex" xmlns:wpg="http://schemas.microsoft.com/office/word/2010/wordprocessingGroup" xmlns:wpi="http://schemas.microsoft.com/office/word/2010/wordprocessingInk" xmlns:wne="http://schemas.microsoft.com/office/word/2006/wordml" xmlns:wps="http://schemas.microsoft.com/office/word/2010/wordprocessingShape" mc:Ignorable="w14 w15 w16se w16cid w16 w16cex w16sdtdh w16sdtfl w16du wp14">
   <w:tbl>
     <w:tblPr>
       <w:tblStyle w:val="Tablaconcuadrcula"/>
@@ -5076,7 +3075,7 @@
 </file>
 
 <file path=word/numbering.xml><?xml version="1.0" encoding="utf-8"?>
-<w:numbering xmlns:wpc="http://schemas.microsoft.com/office/word/2010/wordprocessingCanvas" xmlns:cx="http://schemas.microsoft.com/office/drawing/2014/chartex" xmlns:cx1="http://schemas.microsoft.com/office/drawing/2015/9/8/chartex" xmlns:cx2="http://schemas.microsoft.com/office/drawing/2015/10/21/chartex" xmlns:cx3="http://schemas.microsoft.com/office/drawing/2016/5/9/chartex" xmlns:cx4="http://schemas.microsoft.com/office/drawing/2016/5/10/chartex" xmlns:cx5="http://schemas.microsoft.com/office/drawing/2016/5/11/chartex" xmlns:cx6="http://schemas.microsoft.com/office/drawing/2016/5/12/chartex" xmlns:cx7="http://schemas.microsoft.com/office/drawing/2016/5/13/chartex" xmlns:cx8="http://schemas.microsoft.com/office/drawing/2016/5/14/chartex" xmlns:mc="http://schemas.openxmlformats.org/markup-compatibility/2006" xmlns:aink="http://schemas.microsoft.com/office/drawing/2016/ink" xmlns:am3d="http://schemas.microsoft.com/office/drawing/2017/model3d" xmlns:o="urn:schemas-microsoft-com:office:office" xmlns:r="http://schemas.openxmlformats.org/officeDocument/2006/relationships" xmlns:m="http://schemas.openxmlformats.org/officeDocument/2006/math" xmlns:v="urn:schemas-microsoft-com:vml" xmlns:wp14="http://schemas.microsoft.com/office/word/2010/wordprocessingDrawing" xmlns:wp="http://schemas.openxmlformats.org/drawingml/2006/wordprocessingDrawing" xmlns:w10="urn:schemas-microsoft-com:office:word" xmlns:w="http://schemas.openxmlformats.org/wordprocessingml/2006/main" xmlns:w14="http://schemas.microsoft.com/office/word/2010/wordml" xmlns:w15="http://schemas.microsoft.com/office/word/2012/wordml" xmlns:w16cex="http://schemas.microsoft.com/office/word/2018/wordml/cex" xmlns:w16cid="http://schemas.microsoft.com/office/word/2016/wordml/cid" xmlns:w16="http://schemas.microsoft.com/office/word/2018/wordml" xmlns:w16sdtdh="http://schemas.microsoft.com/office/word/2020/wordml/sdtdatahash" xmlns:w16se="http://schemas.microsoft.com/office/word/2015/wordml/symex" xmlns:wpg="http://schemas.microsoft.com/office/word/2010/wordprocessingGroup" xmlns:wpi="http://schemas.microsoft.com/office/word/2010/wordprocessingInk" xmlns:wne="http://schemas.microsoft.com/office/word/2006/wordml" xmlns:wps="http://schemas.microsoft.com/office/word/2010/wordprocessingShape" mc:Ignorable="w14 w15 w16se w16cid w16 w16cex w16sdtdh wp14">
+<w:numbering xmlns:wpc="http://schemas.microsoft.com/office/word/2010/wordprocessingCanvas" xmlns:cx="http://schemas.microsoft.com/office/drawing/2014/chartex" xmlns:cx1="http://schemas.microsoft.com/office/drawing/2015/9/8/chartex" xmlns:cx2="http://schemas.microsoft.com/office/drawing/2015/10/21/chartex" xmlns:cx3="http://schemas.microsoft.com/office/drawing/2016/5/9/chartex" xmlns:cx4="http://schemas.microsoft.com/office/drawing/2016/5/10/chartex" xmlns:cx5="http://schemas.microsoft.com/office/drawing/2016/5/11/chartex" xmlns:cx6="http://schemas.microsoft.com/office/drawing/2016/5/12/chartex" xmlns:cx7="http://schemas.microsoft.com/office/drawing/2016/5/13/chartex" xmlns:cx8="http://schemas.microsoft.com/office/drawing/2016/5/14/chartex" xmlns:mc="http://schemas.openxmlformats.org/markup-compatibility/2006" xmlns:aink="http://schemas.microsoft.com/office/drawing/2016/ink" xmlns:am3d="http://schemas.microsoft.com/office/drawing/2017/model3d" xmlns:o="urn:schemas-microsoft-com:office:office" xmlns:oel="http://schemas.microsoft.com/office/2019/extlst" xmlns:r="http://schemas.openxmlformats.org/officeDocument/2006/relationships" xmlns:m="http://schemas.openxmlformats.org/officeDocument/2006/math" xmlns:v="urn:schemas-microsoft-com:vml" xmlns:wp14="http://schemas.microsoft.com/office/word/2010/wordprocessingDrawing" xmlns:wp="http://schemas.openxmlformats.org/drawingml/2006/wordprocessingDrawing" xmlns:w10="urn:schemas-microsoft-com:office:word" xmlns:w="http://schemas.openxmlformats.org/wordprocessingml/2006/main" xmlns:w14="http://schemas.microsoft.com/office/word/2010/wordml" xmlns:w15="http://schemas.microsoft.com/office/word/2012/wordml" xmlns:w16cex="http://schemas.microsoft.com/office/word/2018/wordml/cex" xmlns:w16cid="http://schemas.microsoft.com/office/word/2016/wordml/cid" xmlns:w16="http://schemas.microsoft.com/office/word/2018/wordml" xmlns:w16du="http://schemas.microsoft.com/office/word/2023/wordml/word16du" xmlns:w16sdtdh="http://schemas.microsoft.com/office/word/2020/wordml/sdtdatahash" xmlns:w16sdtfl="http://schemas.microsoft.com/office/word/2024/wordml/sdtformatlock" xmlns:w16se="http://schemas.microsoft.com/office/word/2015/wordml/symex" xmlns:wpg="http://schemas.microsoft.com/office/word/2010/wordprocessingGroup" xmlns:wpi="http://schemas.microsoft.com/office/word/2010/wordprocessingInk" xmlns:wne="http://schemas.microsoft.com/office/word/2006/wordml" xmlns:wps="http://schemas.microsoft.com/office/word/2010/wordprocessingShape" mc:Ignorable="w14 w15 w16se w16cid w16 w16cex w16sdtdh w16sdtfl w16du wp14">
   <w:abstractNum w:abstractNumId="0" w15:restartNumberingAfterBreak="0">
     <w:nsid w:val="049156A1"/>
     <w:multiLevelType w:val="hybridMultilevel"/>
@@ -9762,127 +7761,127 @@
       </w:rPr>
     </w:lvl>
   </w:abstractNum>
-  <w:num w:numId="1">
+  <w:num w:numId="1" w16cid:durableId="2020420826">
     <w:abstractNumId w:val="3"/>
   </w:num>
-  <w:num w:numId="2">
+  <w:num w:numId="2" w16cid:durableId="1108894656">
     <w:abstractNumId w:val="9"/>
   </w:num>
-  <w:num w:numId="3">
+  <w:num w:numId="3" w16cid:durableId="1269503924">
     <w:abstractNumId w:val="13"/>
   </w:num>
-  <w:num w:numId="4">
+  <w:num w:numId="4" w16cid:durableId="410079819">
     <w:abstractNumId w:val="29"/>
   </w:num>
-  <w:num w:numId="5">
+  <w:num w:numId="5" w16cid:durableId="37824663">
     <w:abstractNumId w:val="31"/>
   </w:num>
-  <w:num w:numId="6">
+  <w:num w:numId="6" w16cid:durableId="467550706">
     <w:abstractNumId w:val="4"/>
   </w:num>
-  <w:num w:numId="7">
+  <w:num w:numId="7" w16cid:durableId="1701007493">
     <w:abstractNumId w:val="12"/>
   </w:num>
-  <w:num w:numId="8">
+  <w:num w:numId="8" w16cid:durableId="1499493592">
     <w:abstractNumId w:val="20"/>
   </w:num>
-  <w:num w:numId="9">
+  <w:num w:numId="9" w16cid:durableId="274485345">
     <w:abstractNumId w:val="16"/>
   </w:num>
-  <w:num w:numId="10">
+  <w:num w:numId="10" w16cid:durableId="358311435">
     <w:abstractNumId w:val="10"/>
   </w:num>
-  <w:num w:numId="11">
+  <w:num w:numId="11" w16cid:durableId="1579317394">
     <w:abstractNumId w:val="25"/>
   </w:num>
-  <w:num w:numId="12">
+  <w:num w:numId="12" w16cid:durableId="923346323">
     <w:abstractNumId w:val="36"/>
   </w:num>
-  <w:num w:numId="13">
+  <w:num w:numId="13" w16cid:durableId="1447193425">
     <w:abstractNumId w:val="30"/>
   </w:num>
-  <w:num w:numId="14">
+  <w:num w:numId="14" w16cid:durableId="1356928066">
     <w:abstractNumId w:val="1"/>
   </w:num>
-  <w:num w:numId="15">
+  <w:num w:numId="15" w16cid:durableId="39405498">
     <w:abstractNumId w:val="37"/>
   </w:num>
-  <w:num w:numId="16">
+  <w:num w:numId="16" w16cid:durableId="1450274294">
     <w:abstractNumId w:val="22"/>
   </w:num>
-  <w:num w:numId="17">
+  <w:num w:numId="17" w16cid:durableId="949824198">
     <w:abstractNumId w:val="18"/>
   </w:num>
-  <w:num w:numId="18">
+  <w:num w:numId="18" w16cid:durableId="669018019">
     <w:abstractNumId w:val="32"/>
   </w:num>
-  <w:num w:numId="19">
+  <w:num w:numId="19" w16cid:durableId="2065370506">
     <w:abstractNumId w:val="11"/>
   </w:num>
-  <w:num w:numId="20">
+  <w:num w:numId="20" w16cid:durableId="1664160344">
     <w:abstractNumId w:val="40"/>
   </w:num>
-  <w:num w:numId="21">
+  <w:num w:numId="21" w16cid:durableId="702705610">
     <w:abstractNumId w:val="35"/>
   </w:num>
-  <w:num w:numId="22">
+  <w:num w:numId="22" w16cid:durableId="508762923">
     <w:abstractNumId w:val="14"/>
   </w:num>
-  <w:num w:numId="23">
+  <w:num w:numId="23" w16cid:durableId="636573913">
     <w:abstractNumId w:val="15"/>
   </w:num>
-  <w:num w:numId="24">
+  <w:num w:numId="24" w16cid:durableId="1533810091">
     <w:abstractNumId w:val="5"/>
   </w:num>
-  <w:num w:numId="25">
+  <w:num w:numId="25" w16cid:durableId="1081293703">
     <w:abstractNumId w:val="17"/>
   </w:num>
-  <w:num w:numId="26">
+  <w:num w:numId="26" w16cid:durableId="1551960034">
     <w:abstractNumId w:val="21"/>
   </w:num>
-  <w:num w:numId="27">
+  <w:num w:numId="27" w16cid:durableId="1061177180">
     <w:abstractNumId w:val="24"/>
   </w:num>
-  <w:num w:numId="28">
+  <w:num w:numId="28" w16cid:durableId="175271314">
     <w:abstractNumId w:val="0"/>
   </w:num>
-  <w:num w:numId="29">
+  <w:num w:numId="29" w16cid:durableId="65538560">
     <w:abstractNumId w:val="19"/>
   </w:num>
-  <w:num w:numId="30">
+  <w:num w:numId="30" w16cid:durableId="1727878770">
     <w:abstractNumId w:val="23"/>
   </w:num>
-  <w:num w:numId="31">
+  <w:num w:numId="31" w16cid:durableId="829061128">
     <w:abstractNumId w:val="2"/>
   </w:num>
-  <w:num w:numId="32">
+  <w:num w:numId="32" w16cid:durableId="405569291">
     <w:abstractNumId w:val="7"/>
   </w:num>
-  <w:num w:numId="33">
+  <w:num w:numId="33" w16cid:durableId="537016086">
     <w:abstractNumId w:val="33"/>
   </w:num>
-  <w:num w:numId="34">
+  <w:num w:numId="34" w16cid:durableId="393311217">
     <w:abstractNumId w:val="39"/>
   </w:num>
-  <w:num w:numId="35">
+  <w:num w:numId="35" w16cid:durableId="1932084335">
     <w:abstractNumId w:val="6"/>
   </w:num>
-  <w:num w:numId="36">
+  <w:num w:numId="36" w16cid:durableId="1555694959">
     <w:abstractNumId w:val="26"/>
   </w:num>
-  <w:num w:numId="37">
+  <w:num w:numId="37" w16cid:durableId="250436781">
     <w:abstractNumId w:val="38"/>
   </w:num>
-  <w:num w:numId="38">
+  <w:num w:numId="38" w16cid:durableId="67270744">
     <w:abstractNumId w:val="28"/>
   </w:num>
-  <w:num w:numId="39">
+  <w:num w:numId="39" w16cid:durableId="225385586">
     <w:abstractNumId w:val="27"/>
   </w:num>
-  <w:num w:numId="40">
+  <w:num w:numId="40" w16cid:durableId="492572671">
     <w:abstractNumId w:val="34"/>
   </w:num>
-  <w:num w:numId="41">
+  <w:num w:numId="41" w16cid:durableId="1301224667">
     <w:abstractNumId w:val="8"/>
   </w:num>
   <w:numIdMacAtCleanup w:val="18"/>
@@ -9890,7 +7889,7 @@
 </file>
 
 <file path=word/styles.xml><?xml version="1.0" encoding="utf-8"?>
-<w:styles xmlns:mc="http://schemas.openxmlformats.org/markup-compatibility/2006" xmlns:r="http://schemas.openxmlformats.org/officeDocument/2006/relationships" xmlns:w="http://schemas.openxmlformats.org/wordprocessingml/2006/main" xmlns:w14="http://schemas.microsoft.com/office/word/2010/wordml" xmlns:w15="http://schemas.microsoft.com/office/word/2012/wordml" xmlns:w16cex="http://schemas.microsoft.com/office/word/2018/wordml/cex" xmlns:w16cid="http://schemas.microsoft.com/office/word/2016/wordml/cid" xmlns:w16="http://schemas.microsoft.com/office/word/2018/wordml" xmlns:w16sdtdh="http://schemas.microsoft.com/office/word/2020/wordml/sdtdatahash" xmlns:w16se="http://schemas.microsoft.com/office/word/2015/wordml/symex" mc:Ignorable="w14 w15 w16se w16cid w16 w16cex w16sdtdh">
+<w:styles xmlns:mc="http://schemas.openxmlformats.org/markup-compatibility/2006" xmlns:r="http://schemas.openxmlformats.org/officeDocument/2006/relationships" xmlns:w="http://schemas.openxmlformats.org/wordprocessingml/2006/main" xmlns:w14="http://schemas.microsoft.com/office/word/2010/wordml" xmlns:w15="http://schemas.microsoft.com/office/word/2012/wordml" xmlns:w16cex="http://schemas.microsoft.com/office/word/2018/wordml/cex" xmlns:w16cid="http://schemas.microsoft.com/office/word/2016/wordml/cid" xmlns:w16="http://schemas.microsoft.com/office/word/2018/wordml" xmlns:w16du="http://schemas.microsoft.com/office/word/2023/wordml/word16du" xmlns:w16sdtdh="http://schemas.microsoft.com/office/word/2020/wordml/sdtdatahash" xmlns:w16sdtfl="http://schemas.microsoft.com/office/word/2024/wordml/sdtformatlock" xmlns:w16se="http://schemas.microsoft.com/office/word/2015/wordml/symex" mc:Ignorable="w14 w15 w16se w16cid w16 w16cex w16sdtdh w16sdtfl w16du">
   <w:docDefaults>
     <w:rPrDefault>
       <w:rPr>
@@ -10012,6 +8011,7 @@
     <w:lsdException w:name="HTML Sample" w:semiHidden="1" w:unhideWhenUsed="1"/>
     <w:lsdException w:name="HTML Typewriter" w:semiHidden="1" w:unhideWhenUsed="1"/>
     <w:lsdException w:name="HTML Variable" w:semiHidden="1" w:unhideWhenUsed="1"/>
+    <w:lsdException w:name="Normal Table" w:semiHidden="1" w:unhideWhenUsed="1"/>
     <w:lsdException w:name="annotation subject" w:semiHidden="1" w:unhideWhenUsed="1"/>
     <w:lsdException w:name="No List" w:semiHidden="1" w:unhideWhenUsed="1"/>
     <w:lsdException w:name="Outline List 1" w:semiHidden="1" w:unhideWhenUsed="1"/>
@@ -10054,8 +8054,11 @@
     <w:lsdException w:name="Table Contemporary" w:semiHidden="1" w:unhideWhenUsed="1"/>
     <w:lsdException w:name="Table Elegant" w:semiHidden="1" w:unhideWhenUsed="1"/>
     <w:lsdException w:name="Table Professional" w:semiHidden="1" w:unhideWhenUsed="1"/>
+    <w:lsdException w:name="Table Subtle 1" w:semiHidden="1" w:unhideWhenUsed="1"/>
     <w:lsdException w:name="Table Subtle 2" w:semiHidden="1" w:unhideWhenUsed="1"/>
     <w:lsdException w:name="Table Web 1" w:semiHidden="1" w:unhideWhenUsed="1"/>
+    <w:lsdException w:name="Table Web 2" w:semiHidden="1" w:unhideWhenUsed="1"/>
+    <w:lsdException w:name="Table Web 3" w:semiHidden="1" w:unhideWhenUsed="1"/>
     <w:lsdException w:name="Balloon Text" w:semiHidden="1" w:unhideWhenUsed="1"/>
     <w:lsdException w:name="Table Grid" w:uiPriority="39"/>
     <w:lsdException w:name="Table Theme" w:semiHidden="1" w:unhideWhenUsed="1"/>
@@ -10352,7 +8355,6 @@
   <w:style w:type="character" w:default="1" w:styleId="Fuentedeprrafopredeter">
     <w:name w:val="Default Paragraph Font"/>
     <w:uiPriority w:val="1"/>
-    <w:semiHidden/>
     <w:unhideWhenUsed/>
   </w:style>
   <w:style w:type="table" w:default="1" w:styleId="Tablanormal">
@@ -11653,10 +9655,6 @@
 </file>
 
 <file path=customXml/item1.xml><?xml version="1.0" encoding="utf-8"?>
-<b:Sources xmlns:b="http://schemas.openxmlformats.org/officeDocument/2006/bibliography" xmlns="http://schemas.openxmlformats.org/officeDocument/2006/bibliography" SelectedStyle="\APASixthEditionOfficeOnline.xsl" StyleName="APA" Version="6"/>
-</file>
-
-<file path=customXml/item2.xml><?xml version="1.0" encoding="utf-8"?>
 <ct:contentTypeSchema xmlns:ct="http://schemas.microsoft.com/office/2006/metadata/contentType" xmlns:ma="http://schemas.microsoft.com/office/2006/metadata/properties/metaAttributes" ct:_="" ma:_="" ma:contentTypeName="Documento" ma:contentTypeID="0x010100E96778489EE7714D8BD12CC105EB918B" ma:contentTypeVersion="2" ma:contentTypeDescription="Crear nuevo documento." ma:contentTypeScope="" ma:versionID="416c5c7ae9b5d54d83875cd3c65194e3">
   <xsd:schema xmlns:xsd="http://www.w3.org/2001/XMLSchema" xmlns:xs="http://www.w3.org/2001/XMLSchema" xmlns:p="http://schemas.microsoft.com/office/2006/metadata/properties" xmlns:ns2="126e8a1c-9ea9-435a-ac89-d06c80d62e30" targetNamespace="http://schemas.microsoft.com/office/2006/metadata/properties" ma:root="true" ma:fieldsID="70a237c842677bd850644f8595079f5e" ns2:_="">
     <xsd:import namespace="126e8a1c-9ea9-435a-ac89-d06c80d62e30"/>
@@ -11788,13 +9786,13 @@
 </ct:contentTypeSchema>
 </file>
 
-<file path=customXml/item3.xml><?xml version="1.0" encoding="utf-8"?>
+<file path=customXml/item2.xml><?xml version="1.0" encoding="utf-8"?>
 <p:properties xmlns:p="http://schemas.microsoft.com/office/2006/metadata/properties" xmlns:xsi="http://www.w3.org/2001/XMLSchema-instance" xmlns:pc="http://schemas.microsoft.com/office/infopath/2007/PartnerControls">
   <documentManagement/>
 </p:properties>
 </file>
 
-<file path=customXml/item4.xml><?xml version="1.0" encoding="utf-8"?>
+<file path=customXml/item3.xml><?xml version="1.0" encoding="utf-8"?>
 <?mso-contentType ?>
 <FormTemplates xmlns="http://schemas.microsoft.com/sharepoint/v3/contenttype/forms">
   <Display>DocumentLibraryForm</Display>
@@ -11803,15 +9801,11 @@
 </FormTemplates>
 </file>
 
-<file path=customXml/itemProps1.xml><?xml version="1.0" encoding="utf-8"?>
-<ds:datastoreItem xmlns:ds="http://schemas.openxmlformats.org/officeDocument/2006/customXml" ds:itemID="{6E8A10B9-B765-4F0B-A47F-7CB788CD8F65}">
-  <ds:schemaRefs>
-    <ds:schemaRef ds:uri="http://schemas.openxmlformats.org/officeDocument/2006/bibliography"/>
-  </ds:schemaRefs>
-</ds:datastoreItem>
+<file path=customXml/item4.xml><?xml version="1.0" encoding="utf-8"?>
+<b:Sources xmlns:b="http://schemas.openxmlformats.org/officeDocument/2006/bibliography" xmlns="http://schemas.openxmlformats.org/officeDocument/2006/bibliography" SelectedStyle="\APASixthEditionOfficeOnline.xsl" StyleName="APA" Version="6"/>
 </file>
 
-<file path=customXml/itemProps2.xml><?xml version="1.0" encoding="utf-8"?>
+<file path=customXml/itemProps1.xml><?xml version="1.0" encoding="utf-8"?>
 <ds:datastoreItem xmlns:ds="http://schemas.openxmlformats.org/officeDocument/2006/customXml" ds:itemID="{767CD2D5-7A6C-47C3-9B54-C4225C74DD0B}">
   <ds:schemaRefs>
     <ds:schemaRef ds:uri="http://schemas.microsoft.com/office/2006/metadata/contentType"/>
@@ -11829,7 +9823,7 @@
 </ds:datastoreItem>
 </file>
 
-<file path=customXml/itemProps3.xml><?xml version="1.0" encoding="utf-8"?>
+<file path=customXml/itemProps2.xml><?xml version="1.0" encoding="utf-8"?>
 <ds:datastoreItem xmlns:ds="http://schemas.openxmlformats.org/officeDocument/2006/customXml" ds:itemID="{5F1783E3-BA1C-4CA3-8E32-C9B378BBED03}">
   <ds:schemaRefs>
     <ds:schemaRef ds:uri="http://schemas.microsoft.com/office/2006/metadata/properties"/>
@@ -11838,10 +9832,18 @@
 </ds:datastoreItem>
 </file>
 
-<file path=customXml/itemProps4.xml><?xml version="1.0" encoding="utf-8"?>
+<file path=customXml/itemProps3.xml><?xml version="1.0" encoding="utf-8"?>
 <ds:datastoreItem xmlns:ds="http://schemas.openxmlformats.org/officeDocument/2006/customXml" ds:itemID="{DABAA964-10BA-4DBC-ABF2-CDEAC0FAF7AA}">
   <ds:schemaRefs>
     <ds:schemaRef ds:uri="http://schemas.microsoft.com/sharepoint/v3/contenttype/forms"/>
   </ds:schemaRefs>
 </ds:datastoreItem>
+</file>
+
+<file path=customXml/itemProps4.xml><?xml version="1.0" encoding="utf-8"?>
+<ds:datastoreItem xmlns:ds="http://schemas.openxmlformats.org/officeDocument/2006/customXml" ds:itemID="{6E8A10B9-B765-4F0B-A47F-7CB788CD8F65}">
+  <ds:schemaRefs>
+    <ds:schemaRef ds:uri="http://schemas.openxmlformats.org/officeDocument/2006/bibliography"/>
+  </ds:schemaRefs>
+</ds:datastoreItem>
 </file>
</xml_diff>